<commit_message>
Compenso calcolato al netto delle commissioni delle piattaforme (art. 10)
Co-Authored-By: Claude Opus 5.5 <noreply@anthropic.com>
Claude-Session: https://claude.ai/code/session_01WggD5zVqy5TCJTD9M5VXmn
</commit_message>
<xml_diff>
--- a/contratti/Contratto_Mandato_BB_Hospitality_def.docx
+++ b/contratti/Contratto_Mandato_BB_Hospitality_def.docx
@@ -2700,31 +2700,7 @@
         <w:jc w:val="both"/>
       </w:pPr>
       <w:r>
-        <w:t>Per l’attività di gestione e per i servizi di cui all’art. 2, al Property Ma</w:t>
-      </w:r>
-      <w:r>
-        <w:t xml:space="preserve">nager spetta un compenso pari al </w:t>
-      </w:r>
-      <w:r>
-        <w:rPr>
-          <w:b/>
-        </w:rPr>
-        <w:t>20% (venti per cento) del Costo del Pernottamento</w:t>
-      </w:r>
-      <w:r>
-        <w:t xml:space="preserve"> di ciascuna prenotazione. Per “</w:t>
-      </w:r>
-      <w:r>
-        <w:rPr>
-          <w:b/>
-        </w:rPr>
-        <w:t>Costo del Pernottamento</w:t>
-      </w:r>
-      <w:r>
-        <w:t>” si intende il prezzo dei pernottamenti dovuto dall’Ospite, come risultante dalla prenotazione, al lordo delle commiss</w:t>
-      </w:r>
-      <w:r>
-        <w:t>ioni delle piattaforme di prenotazione ed escluse l’imposta di soggiorno, l’eventuale deposito cauzionale, le spese di pulizia finale eventualmente addebitate separatamente all’Ospite e le commissioni di servizio addebitate all’Ospite dalle piattaforme.</w:t>
+        <w:t xml:space="preserve">Per l’attività di gestione e per i servizi di cui all’art. 2, al Property Manager spetta un compenso pari al 20% (venti per cento) del Costo del Pernottamento di ciascuna prenotazione. Per “Costo del Pernottamento” si intende il prezzo dei pernottamenti dovuto dall’Ospite, come risultante dalla prenotazione, al netto delle commissioni trattenute dalle piattaforme di prenotazione ed escluse l’imposta di soggiorno, l’eventuale deposito cauzionale, le spese di pulizia finale eventualmente addebitate separatamente all’Ospite e le commissioni di servizio addebitate all’Ospite dalle piattaforme.</w:t>
       </w:r>
     </w:p>
     <w:p>

</xml_diff>

<commit_message>
Revisione contratto artt. 1-9: check-in da remoto, Kross Booking, disponibilità immobile, nuovo art. 7 media durata, sub-delega, pagamenti entro il 5
Co-Authored-By: Claude Opus 5.5 <noreply@anthropic.com>
Claude-Session: https://claude.ai/code/session_01WggD5zVqy5TCJTD9M5VXmn
</commit_message>
<xml_diff>
--- a/contratti/Contratto_Mandato_BB_Hospitality_def.docx
+++ b/contratti/Contratto_Mandato_BB_Hospitality_def.docx
@@ -1140,14 +1140,7 @@
         <w:rPr>
           <w:color w:val="000009"/>
         </w:rPr>
-        <w:t xml:space="preserve">determinare, di concerto con il Mandante, i corrispettivi da richiedere agli Ospiti (distinti fra quota relativa alla locazione dell’immobile e quota relativa ai servizi che il Property Manager fornisce direttamente agli Ospiti) tenuto conto della durata e della stagione e/o del numero di occupanti in cui si </w:t>
-      </w:r>
-      <w:r>
-        <w:rPr>
-          <w:color w:val="000009"/>
-        </w:rPr>
-        <w:lastRenderedPageBreak/>
-        <w:t>svolgerà la locazione, corrispettivi che verranno indicati nella tabella di cui all’art. 6;</w:t>
+        <w:t xml:space="preserve">determinare, di concerto con il Mandante, i corrispettivi da richiedere agli Ospiti (distinti fra quota relativa alla locazione dell’Immobile e quota relativa ai servizi che il Property Manager fornisce direttamente agli Ospiti), tenuto conto della durata del soggiorno, della stagione e del numero di occupanti;</w:t>
       </w:r>
     </w:p>
     <w:p>
@@ -1448,7 +1441,7 @@
         <w:jc w:val="both"/>
       </w:pPr>
       <w:r>
-        <w:t>comunicare tempestivamente al Mandante, dal momento in cui ne viene a conoscenza, la necessità di interventi di manutenzione ordinaria o straordinaria o di modifica dell’Immobile, ritenuti dal Property Manager opportuni o necessari o segnalati dagli Ospiti, trasmettendo il relativo preventivo secondo quanto previsto dall’art. 12;</w:t>
+        <w:t xml:space="preserve">comunicare tempestivamente al Mandante, dal momento in cui ne viene a conoscenza, la necessità di interventi di manutenzione ordinaria o straordinaria o di modifica dell’Immobile, ritenuti dal Property Manager opportuni o necessari o segnalati dagli Ospiti, trasmettendo il relativo preventivo secondo quanto previsto dall’art. 13;</w:t>
       </w:r>
     </w:p>
     <w:p>
@@ -1485,7 +1478,7 @@
         <w:jc w:val="both"/>
       </w:pPr>
       <w:r>
-        <w:t>rimuovere senza indugio, alla cessazione del rapporto, ogni riferimento, informazione, fotografia ed in genere contenuto anche multimediale, relativo all’Immobile, dal proprio sito internet o portale o da ogni annuncio creato su qualsivoglia canale, fatto salvo quanto previsto dall’art. 16 per le Prenotazioni Future.</w:t>
+        <w:t xml:space="preserve">rimuovere senza indugio, alla cessazione del rapporto, ogni riferimento, informazione, fotografia ed in genere contenuto anche multimediale, relativo all’Immobile, dal proprio sito internet o portale o da ogni annuncio creato su qualsivoglia canale, fatto salvo quanto previsto dall’art. 17 per le Prenotazioni Future.</w:t>
       </w:r>
     </w:p>
     <w:p>
@@ -1556,7 +1549,7 @@
         <w:jc w:val="both"/>
       </w:pPr>
       <w:r>
-        <w:t>un inventario completo di mobilio, arredi e biancheria da destinare agli Ospiti stessi;</w:t>
+        <w:t>prendere contatto con gli Ospiti per accordi su orario di arrivo e partenza, inviando messaggi mail di benvenuto con le istruzioni per check-in e check-out</w:t>
       </w:r>
     </w:p>
     <w:p>
@@ -1575,7 +1568,10 @@
         <w:jc w:val="both"/>
       </w:pPr>
       <w:r>
-        <w:t>prendere contatto con gli Ospiti per accordi su orario di arrivo e partenza, inviando messaggi mail di benvenuto con le istruzioni per check-in e check-out</w:t>
+        <w:rPr>
+          <w:i/>
+        </w:rPr>
+        <w:t xml:space="preserve">check-in degli Ospiti, svolto da remoto nel rispetto della normativa italiana vigente in materia di identificazione degli alloggiati, ivi compreso l’obbligo di riconoscimento de visu ove previsto, anche mediante strumenti di identificazione a distanza conformi a tale normativa; invio delle istruzioni di accesso all’Immobile e del vademecum di cui alla lettera a) del presente comma; nonché riscossione dell’imposta di soggiorno con contestuale emissione della relativa ricevuta e acquisizione dei documenti di identità degli alloggiati per la comunicazione alla Questura;</w:t>
       </w:r>
     </w:p>
     <w:p>
@@ -1594,14 +1590,7 @@
         <w:jc w:val="both"/>
       </w:pPr>
       <w:r>
-        <w:rPr>
-          <w:i/>
-        </w:rPr>
-        <w:lastRenderedPageBreak/>
-        <w:t>check-in</w:t>
-      </w:r>
-      <w:r>
-        <w:t xml:space="preserve"> con accoglienza degli Ospiti presso l’Immobile, descrizione di tutti gli aspetti funzionali e consegna delle chiavi e del vademecum di cui alla lettera a) del presente comma del presente articolo; nonché riscossione dell’importo della imposta di soggiorno con contestuale emissione della relativa ricevuta e acquisizione dei documenti di identità degli alloggiati per la comunicazione in PS;</w:t>
+        <w:t>l’assistenza dell’Ospite per tutta la durata del soggiorno per eventuali esigenze o problemi connessi al rapporto locatizio;</w:t>
       </w:r>
     </w:p>
     <w:p>
@@ -1620,7 +1609,16 @@
         <w:jc w:val="both"/>
       </w:pPr>
       <w:r>
-        <w:t>l’assistenza dell’Ospite per tutta la durata del soggiorno per eventuali esigenze o problemi connessi al rapporto locatizio;</w:t>
+        <w:t xml:space="preserve">al </w:t>
+      </w:r>
+      <w:r>
+        <w:rPr>
+          <w:i/>
+        </w:rPr>
+        <w:t>check-out</w:t>
+      </w:r>
+      <w:r>
+        <w:t xml:space="preserve"> alla fine del soggiorno, alla verifica dell’Immobile ed al ritiro delle chiavi;</w:t>
       </w:r>
     </w:p>
     <w:p>
@@ -1639,7 +1637,7 @@
         <w:jc w:val="both"/>
       </w:pPr>
       <w:r>
-        <w:t xml:space="preserve">al </w:t>
+        <w:t xml:space="preserve">la pulizia accurata dell’Immobile ad ogni </w:t>
       </w:r>
       <w:r>
         <w:rPr>
@@ -1648,7 +1646,7 @@
         <w:t>check-out</w:t>
       </w:r>
       <w:r>
-        <w:t xml:space="preserve"> alla fine del soggiorno, alla verifica dell’Immobile ed al ritiro delle chiavi;</w:t>
+        <w:t xml:space="preserve"> e pulizie straordinarie periodiche, gestite in via esclusiva dal Property Manager tramite personale o ditte specializzate da esso incaricati;</w:t>
       </w:r>
     </w:p>
     <w:p>
@@ -1667,7 +1665,7 @@
         <w:jc w:val="both"/>
       </w:pPr>
       <w:r>
-        <w:t xml:space="preserve">la pulizia accurata dell’Immobile ad ogni </w:t>
+        <w:t xml:space="preserve">la verifica e gestione della biancheria ad ogni </w:t>
       </w:r>
       <w:r>
         <w:rPr>
@@ -1676,7 +1674,7 @@
         <w:t>check-out</w:t>
       </w:r>
       <w:r>
-        <w:t xml:space="preserve"> e pulizie straordinarie periodiche, gestite in via esclusiva dal Property Manager tramite personale o ditte specializzate da esso incaricati;</w:t>
+        <w:t xml:space="preserve"> ed al relativo lavaggio, incaricando all’uopo lavanderie.</w:t>
       </w:r>
     </w:p>
     <w:p>
@@ -1695,34 +1693,6 @@
         <w:jc w:val="both"/>
       </w:pPr>
       <w:r>
-        <w:t xml:space="preserve">la verifica e gestione della biancheria ad ogni </w:t>
-      </w:r>
-      <w:r>
-        <w:rPr>
-          <w:i/>
-        </w:rPr>
-        <w:t>check-out</w:t>
-      </w:r>
-      <w:r>
-        <w:t xml:space="preserve"> ed al relativo lavaggio, incaricando all’uopo lavanderie.</w:t>
-      </w:r>
-    </w:p>
-    <w:p>
-      <w:pPr>
-        <w:pStyle w:val="Paragrafoelenco"/>
-        <w:numPr>
-          <w:ilvl w:val="0"/>
-          <w:numId w:val="27"/>
-        </w:numPr>
-        <w:tabs>
-          <w:tab w:val="left" w:pos="1141"/>
-          <w:tab w:val="left" w:pos="1143"/>
-        </w:tabs>
-        <w:spacing w:line="360" w:lineRule="auto"/>
-        <w:ind w:left="357" w:hanging="357"/>
-        <w:jc w:val="both"/>
-      </w:pPr>
-      <w:r>
         <w:t>Eventuali servizi extra richiesti dagli ospiti quali, a mero titolo esemplificativo, pulizie o cambi di biancheria durante il soggiorno, organizzazione servizi di trasferimento, organizzazione di visite guidate e altre esperienze.</w:t>
       </w:r>
     </w:p>
@@ -1815,7 +1785,7 @@
         <w:jc w:val="both"/>
       </w:pPr>
       <w:r>
-        <w:t>Il Property Manager invierà a cadenza mensile, in formato elettronico o cartaceo ove richiesto, un resoconto della attività di alloggio svolta al Mandante, in cui verranno precisati il nome e/o la ragione sociale degli Ospiti che hanno goduto dell’Immobile, le date di inizio e conclusione di ogni singolo periodo di alloggio per ciascun Ospite, l’importo del canone corrisposto dall’Ospite per ogni singolo periodo di locazione, gli importi dei compensi maturati dal Property Manager, le spese sostenute e le commissioni o compensi versati a terzi (ad es: piattaforme online).</w:t>
+        <w:t xml:space="preserve">Il Property Manager fornisce al Mandante le credenziali di accesso al Portale Proprietari del gestionale Kross Booking, nel quale il Mandante può consultare in ogni momento, per ciascuna prenotazione, il nome degli Ospiti, le date di inizio e di conclusione del soggiorno, l’importo corrisposto dall’Ospite, le commissioni trattenute dalle piattaforme di prenotazione, i compensi maturati dal Property Manager e le spese sostenute. Il rendiconto mensile dell’attività è reso disponibile al Mandante tramite il medesimo portale o, su richiesta, in formato elettronico.</w:t>
       </w:r>
     </w:p>
     <w:p>
@@ -1901,8 +1871,7 @@
         <w:jc w:val="both"/>
       </w:pPr>
       <w:r>
-        <w:lastRenderedPageBreak/>
-        <w:t>Qualora il Mandante dovesse avere l’esigenza di utilizzare l’Immobile in corso di Contratto avrà l’obbligo di segnalare, con preavviso di almeno 90 giorni al Property Manager tale esigenza anticipatamente per iscritto in modo da consentirgli il blocco delle date in cui dovrà utilizzare l’Immobile (d’ora in avanti le “Date Escluse”), anche attraverso il portale dedicato alle prenotazioni, di cui gli verrà fornito l’accesso.</w:t>
+        <w:t xml:space="preserve">Il Mandante può utilizzare l’Immobile per uso proprio secondo criteri di ragionevolezza e buona fede, dandone comunicazione scritta al Property Manager (anche a mezzo e-mail o messaggistica istantanea), affinché questi possa bloccare le relative date (d’ora in avanti le “Date Escluse”), anche attraverso il portale dedicato alle prenotazioni, di cui gli verrà fornito l’accesso. Il Mandante non potrà occupare l’Immobile nei periodi di alta stagione, salvo preventivo accordo con il Property Manager; potrà invece utilizzarlo, anche con breve preavviso, nei periodi in cui l’Immobile risulti libero da prenotazioni.</w:t>
       </w:r>
     </w:p>
     <w:p>
@@ -1929,7 +1898,7 @@
         <w:jc w:val="both"/>
       </w:pPr>
       <w:r>
-        <w:t>che le Date Escluse non potranno superare i 90 giorni per anno solare;</w:t>
+        <w:t xml:space="preserve">che le Date Escluse non potranno superare i 60 giorni per anno solare;</w:t>
       </w:r>
     </w:p>
     <w:p>
@@ -2022,16 +1991,26 @@
         <w:jc w:val="both"/>
       </w:pPr>
       <w:r>
-        <w:t xml:space="preserve">In conformità all’incarico ricevuto, il Property Manager avrà facoltà di locare l’Immobile sia per periodi inferiori al mese che per periodi superiori ma, in ogni caso, </w:t>
-      </w:r>
-      <w:r>
+        <w:t xml:space="preserve">In conformità all’incarico ricevuto, il Property Manager concede l’Immobile in locazione breve, per periodi inferiori a 30 giorni, nel rispetto della normativa nazionale e locale applicabile. Le locazioni di durata superiore sono disciplinate dall’art. 7.</w:t>
+      </w:r>
+    </w:p>
+    <w:p>
+      <w:pPr>
+        <w:pStyle w:val="Corpotesto"/>
+        <w:spacing w:line="360" w:lineRule="auto"/>
+        <w:jc w:val="both"/>
         <w:rPr>
           <w:b/>
         </w:rPr>
-        <w:t>inferiori all’anno solare</w:t>
-      </w:r>
-      <w:r>
-        <w:t xml:space="preserve"> (salvo diverso accordo tra le Parti), e comunque inferiori alla durata massima stabilita dalla normativa vigente in materia di locazione, nazionale e locale, applicabile.</w:t>
+      </w:pPr>
+      <w:r>
+        <w:t xml:space="preserve">Per tutte le locazioni, il Property Manager dovrà far sottoscrivere all’Ospite un </w:t>
+      </w:r>
+      <w:r>
+        <w:rPr>
+          <w:b/>
+        </w:rPr>
+        <w:t>contratto di locazione in forma scritta.</w:t>
       </w:r>
     </w:p>
     <w:p>
@@ -2039,18 +2018,9 @@
         <w:pStyle w:val="Corpotesto"/>
         <w:spacing w:line="360" w:lineRule="auto"/>
         <w:jc w:val="both"/>
-        <w:rPr>
-          <w:b/>
-        </w:rPr>
-      </w:pPr>
-      <w:r>
-        <w:t xml:space="preserve">Per tutte le locazioni, il Property Manager dovrà far sottoscrivere all’Ospite un </w:t>
-      </w:r>
-      <w:r>
-        <w:rPr>
-          <w:b/>
-        </w:rPr>
-        <w:t>contratto di locazione in forma scritta.</w:t>
+      </w:pPr>
+      <w:r>
+        <w:t xml:space="preserve">Il canone di ciascuna locazione breve è determinato dal Property Manager, di concerto con il Mandante, in base alla stagionalità, al numero degli occupanti e alla durata del soggiorno, applicando una tariffa giornaliera per i giorni di effettiva locazione dell’Immobile.</w:t>
       </w:r>
     </w:p>
     <w:p>
@@ -2060,56 +2030,10 @@
         <w:jc w:val="both"/>
       </w:pPr>
       <w:r>
-        <w:t xml:space="preserve">L’importo del canone per ciascuna locazione varierà, oltre che in base alla stagionalità, e/o in base al numero degli occupanti, anche in funzione della durata della locazione essendo espressamente convenuto che, per quanto concerne le locazioni di medio termine (ovvero superiori a 30 giorni), il canone viene pattuito sulla base di un forfait settimanale o mensile, mentre per quelle di breve termine (ovvero inferiori a 30 giorni) in base alla tariffa giornaliera da applicarsi per i giorni di effettiva locazione dell’Immobile, il tutto come analiticamente dettagliato nella </w:t>
-      </w:r>
-      <w:r>
-        <w:rPr>
-          <w:b/>
-        </w:rPr>
-        <w:t>Tabella allegata</w:t>
-      </w:r>
-      <w:r>
-        <w:t xml:space="preserve"> (“allegato e” – d’ora in avanti “Tabella”), la quale, siglata dalle Parti, diviene parte integrante ed essenziale del presente Contratto.</w:t>
-      </w:r>
-    </w:p>
-    <w:p>
-      <w:pPr>
-        <w:pStyle w:val="Corpotesto"/>
-        <w:spacing w:line="360" w:lineRule="auto"/>
-        <w:jc w:val="both"/>
-      </w:pPr>
-      <w:r>
-        <w:t xml:space="preserve">Le somme e le percentuali di cui alla Tabella, per quanto riguarda la determinazione dei canoni, </w:t>
-      </w:r>
-      <w:bookmarkStart w:id="6" w:name="Le_somme_e_le_percentuali_di_cui_alla_Ta"/>
-      <w:bookmarkEnd w:id="6"/>
-      <w:r>
-        <w:t xml:space="preserve">indicano gli </w:t>
-      </w:r>
-      <w:r>
-        <w:rPr>
-          <w:b/>
-        </w:rPr>
-        <w:t>importi minimi</w:t>
-      </w:r>
-      <w:r>
-        <w:t xml:space="preserve"> da richiedere agli Ospiti (che pertanto potranno variare solo in aumento a discrezione del Property Manager) e potranno comunque essere modificati dalle Parti in corso di rapporto in forma scritta.</w:t>
-      </w:r>
-    </w:p>
-    <w:p>
-      <w:pPr>
-        <w:pStyle w:val="Corpotesto"/>
-        <w:spacing w:line="360" w:lineRule="auto"/>
-        <w:jc w:val="both"/>
-      </w:pPr>
-      <w:r>
-        <w:t xml:space="preserve">Per le locazioni a breve termine, il canone indicato nella Tabella è comprensivo del rimborso delle </w:t>
+        <w:t xml:space="preserve">Per le locazioni a breve termine, il canone è comprensivo del rimborso delle spese condominiali ordinarie, della Tassa Rifiuti e delle Utenze (elettricità, gas, internet, ecc.) dell’Immobile, oltre a qualsiasi altra spesa / imposta / tassa non espressamente indicata nel presente Contratto.</w:t>
       </w:r>
       <w:bookmarkStart w:id="7" w:name="Per_le_locazioni_a_breve_termine,_il_can"/>
       <w:bookmarkEnd w:id="7"/>
-      <w:r>
-        <w:t>spese condominiali ordinarie, della Tassa Rifiuti e delle Utenze (elettricità, gas, internet, ecc.) dell’Immobile oltre a qualsiasi altra spesa / imposta / tassa non espressamente indicata nel presente Contratto.</w:t>
-      </w:r>
     </w:p>
     <w:p>
       <w:pPr>
@@ -2118,13 +2042,10 @@
         <w:jc w:val="both"/>
       </w:pPr>
       <w:r>
-        <w:t xml:space="preserve">Per le locazioni a breve termine, inoltre, i corrispettivi ricevuti dal Property Manager a titolo di </w:t>
+        <w:t xml:space="preserve">Per le locazioni a breve termine, inoltre, i corrispettivi ricevuti dal Property Manager a titolo di canone di locazione saranno versati, senza maggiorazione di interessi, dal Property Manager al Mandante mensilmente, secondo quanto previsto dagli artt. 10 e 11, al netto delle eventuali ritenute di legge sull’ammontare dei canoni, ove previste dalla normativa. </w:t>
       </w:r>
       <w:bookmarkStart w:id="8" w:name="Per_le_locazioni_a_breve_termine,_inoltr"/>
       <w:bookmarkEnd w:id="8"/>
-      <w:r>
-        <w:t xml:space="preserve">canone di locazione saranno versati, senza maggiorazione di interessi, dal Property Manager al Mandante mensilmente, secondo quanto previsto dagli artt. 9 e 10, al netto delle eventuali ritenute di legge sull’ammontare dei canoni, ove previste dalla normativa. </w:t>
-      </w:r>
     </w:p>
     <w:p>
       <w:pPr>
@@ -2153,7 +2074,7 @@
         <w:jc w:val="both"/>
       </w:pPr>
       <w:r>
-        <w:t>Le spese di manutenzione e riparazione dell’Immobile, sia ordinarie sia straordinarie, sono a carico del Mandante e sono regolate dal successivo art. 12.</w:t>
+        <w:t xml:space="preserve">Le spese di manutenzione e riparazione dell’Immobile, sia ordinarie sia straordinarie, sono a carico del Mandante e sono regolate dal successivo art. 13.</w:t>
       </w:r>
     </w:p>
     <w:p>
@@ -2220,12 +2141,6 @@
     </w:p>
     <w:p>
       <w:pPr>
-        <w:pStyle w:val="Corpotesto"/>
-        <w:spacing w:before="8"/>
-      </w:pPr>
-    </w:p>
-    <w:p>
-      <w:pPr>
         <w:pStyle w:val="Titolo21"/>
         <w:numPr>
           <w:ilvl w:val="0"/>
@@ -2234,6 +2149,99 @@
         <w:tabs>
           <w:tab w:val="left" w:pos="782"/>
         </w:tabs>
+        <w:ind w:left="0" w:hanging="358"/>
+        <w:jc w:val="both"/>
+      </w:pPr>
+      <w:r>
+        <w:t xml:space="preserve">Locazioni di media durata</w:t>
+      </w:r>
+    </w:p>
+    <w:p>
+      <w:pPr>
+        <w:pStyle w:val="Corpotesto"/>
+        <w:spacing w:before="130" w:line="360" w:lineRule="auto"/>
+        <w:jc w:val="both"/>
+      </w:pPr>
+      <w:r>
+        <w:t xml:space="preserve">In via ordinaria l’Immobile è destinato alla locazione breve. In caso di necessità e previo accordo scritto con il Mandante, anche a mezzo e-mail, le Parti potranno optare per la locazione dell’Immobile a medio termine, per periodi superiori a 30 giorni e comunque inferiori all’anno e alla durata massima consentita dalla normativa vigente, secondo i criteri stabiliti dal presente articolo.</w:t>
+      </w:r>
+    </w:p>
+    <w:p>
+      <w:pPr>
+        <w:pStyle w:val="Corpotesto"/>
+        <w:spacing w:before="130" w:line="360" w:lineRule="auto"/>
+        <w:jc w:val="both"/>
+      </w:pPr>
+      <w:r>
+        <w:t xml:space="preserve">Per le locazioni di media durata:</w:t>
+      </w:r>
+    </w:p>
+    <w:p>
+      <w:pPr>
+        <w:pStyle w:val="Corpotesto"/>
+        <w:spacing w:before="130" w:line="360" w:lineRule="auto"/>
+        <w:jc w:val="both"/>
+      </w:pPr>
+      <w:r>
+        <w:t xml:space="preserve">a) il canone è pattuito in misura forfettaria settimanale o mensile, concordata di volta in volta tra le Parti;</w:t>
+      </w:r>
+    </w:p>
+    <w:p>
+      <w:pPr>
+        <w:pStyle w:val="Corpotesto"/>
+        <w:spacing w:before="130" w:line="360" w:lineRule="auto"/>
+        <w:jc w:val="both"/>
+      </w:pPr>
+      <w:r>
+        <w:t xml:space="preserve">b) il Property Manager fa sottoscrivere al conduttore un contratto di locazione in forma scritta, conforme alla normativa applicabile, e ne cura la registrazione ai sensi dell’art. 9, con costo a carico del Mandante;</w:t>
+      </w:r>
+    </w:p>
+    <w:p>
+      <w:pPr>
+        <w:pStyle w:val="Corpotesto"/>
+        <w:spacing w:before="130" w:line="360" w:lineRule="auto"/>
+        <w:jc w:val="both"/>
+      </w:pPr>
+      <w:r>
+        <w:t xml:space="preserve">c) il Property Manager richiede al conduttore un adeguato deposito cauzionale o idonee garanzie, che gestisce ai sensi dell’art. 12;</w:t>
+      </w:r>
+    </w:p>
+    <w:p>
+      <w:pPr>
+        <w:pStyle w:val="Corpotesto"/>
+        <w:spacing w:before="130" w:line="360" w:lineRule="auto"/>
+        <w:jc w:val="both"/>
+      </w:pPr>
+      <w:r>
+        <w:t xml:space="preserve">d) il compenso del Property Manager è pari alla percentuale prevista dall’art. 11, calcolata sul canone pattuito al netto delle eventuali commissioni delle piattaforme di prenotazione, salvo diverso accordo scritto tra le Parti;</w:t>
+      </w:r>
+    </w:p>
+    <w:p>
+      <w:pPr>
+        <w:pStyle w:val="Corpotesto"/>
+        <w:spacing w:before="130" w:line="360" w:lineRule="auto"/>
+        <w:jc w:val="both"/>
+      </w:pPr>
+      <w:r>
+        <w:t xml:space="preserve">e) per quanto non diversamente previsto, si applicano le disposizioni del presente Contratto in quanto compatibili.</w:t>
+      </w:r>
+    </w:p>
+    <w:p>
+      <w:pPr>
+        <w:pStyle w:val="Corpotesto"/>
+        <w:spacing w:before="8"/>
+      </w:pPr>
+    </w:p>
+    <w:p>
+      <w:pPr>
+        <w:pStyle w:val="Titolo21"/>
+        <w:numPr>
+          <w:ilvl w:val="0"/>
+          <w:numId w:val="9"/>
+        </w:numPr>
+        <w:tabs>
+          <w:tab w:val="left" w:pos="782"/>
+        </w:tabs>
         <w:spacing w:before="1"/>
         <w:ind w:left="0" w:hanging="358"/>
       </w:pPr>
@@ -2530,7 +2538,7 @@
         <w:jc w:val="both"/>
       </w:pPr>
       <w:r>
-        <w:t>Il Mandante autorizza espressamente il Property Manager a sub-delegare a soggetti terzi – ognuno per quanto di competenza – le attività tecniche, operative, fiscali e contabili oggetto del presente contratto, con costi e responsabilità a carico del Property Manager, fatta eccezione per i costi che il presente Contratto pone a carico del Mandante (tra cui servizi di pulizia, biancheria e lavanderia, commissioni delle piattaforme di prenotazione, manutenzioni e Interventi in Loco), regolati dagli artt. 10, 12 e 13.</w:t>
+        <w:t xml:space="preserve">Il Mandante autorizza espressamente il Property Manager ad avvalersi, per lo svolgimento delle attività tecniche, operative, fiscali e contabili oggetto del presente Contratto, di collaboratori e soggetti terzi (a titolo esemplificativo: addetti alle pulizie, lavanderie, manutentori, consulenti), ognuno per quanto di competenza. Il Property Manager risponde dell’operato di tali soggetti come del fatto proprio. I relativi costi sono a carico del Property Manager, ad eccezione di quelli che il presente Contratto pone a carico del Mandante, ossia i servizi di pulizia, biancheria e lavanderia e le commissioni delle piattaforme di prenotazione (art. 11), le manutenzioni (art. 13) e gli Interventi in Loco nei casi previsti dall’art. 14.</w:t>
       </w:r>
     </w:p>
     <w:p>
@@ -2605,10 +2613,7 @@
         <w:rPr>
           <w:b/>
         </w:rPr>
-        <w:t>Entro il giorno 28 di ogni mese</w:t>
-      </w:r>
-      <w:r>
-        <w:t xml:space="preserve"> solare, il Property Manager verserà al Mandante le somme a lui spettanti per l’effettivo periodo di occupazione maturato nel mese solare precedente, determinate ai sensi del successivo art. 10, ossia il ricavo dei soggiorni dedotti il compenso del Property Manager, tutti i costi ordinari e straordinari a carico del Mandante e le eventuali ritenute di legge.</w:t>
+        <w:t xml:space="preserve">Il Property Manager verserà al Mandante le somme a lui spettanti per l’effettivo periodo di occupazione maturato nel mese solare precedente, determinate ai sensi del successivo art. 11, ossia il ricavo dei soggiorni dedotti il compenso del Property Manager, tutti i costi ordinari e straordinari a carico del Mandante e le eventuali ritenute di legge. Il versamento avviene di norma entro il giorno 5 del mese successivo a quello di maturazione; qualora le piattaforme di prenotazione accreditino le somme in ritardo, il versamento avverrà entro l’ultimo giorno di tale mese e, in ogni caso, solo dopo l’effettivo incasso delle relative somme da parte del Property Manager.</w:t>
       </w:r>
     </w:p>
     <w:p>
@@ -2710,32 +2715,7 @@
         <w:jc w:val="both"/>
       </w:pPr>
       <w:r>
-        <w:t>Al</w:t>
-      </w:r>
-      <w:r>
-        <w:t xml:space="preserve"> Mandante spetta il ricavo complessivo dei soggiorni (esclusa l’imposta di soggiorno, che il Property Manager riversa al Comune), </w:t>
-      </w:r>
-      <w:r>
-        <w:rPr>
-          <w:b/>
-        </w:rPr>
-        <w:t xml:space="preserve">dedotti il compenso del Property Manager di cui al comma precedente e </w:t>
-      </w:r>
-      <w:r>
-        <w:rPr>
-          <w:b/>
-        </w:rPr>
-        <w:lastRenderedPageBreak/>
-        <w:t>tutti i costi, ordinari e straordinari</w:t>
-      </w:r>
-      <w:r>
-        <w:t>, relativi all’Imm</w:t>
-      </w:r>
-      <w:r>
-        <w:t>obile e alla sua gestione, tra cui, a titolo esemplificativo: le commissioni delle piattaforme di prenotazione e dei sistemi di pagamento; i servizi di pulizia, biancheria e lavanderia; i prodotti di cortesia e i materiali di consumo; le manutenzioni di cu</w:t>
-      </w:r>
-      <w:r>
-        <w:t>i all’art. 12; gli Interventi in Loco a carico del Mandante ai sensi dell’art. 13; le eventuali ritenute di legge. Tali importi sono versati mensilmente ai sensi dell’art. 9 e dettagliati nel rendiconto mensile di cui all’art. 4.</w:t>
+        <w:t xml:space="preserve">Al Mandante spetta il ricavo complessivo dei soggiorni (esclusa l’imposta di soggiorno, che il Property Manager riversa al Comune), dedotti il compenso del Property Manager di cui al comma precedente e tutti i costi, ordinari e straordinari, relativi all’Immobile e alla sua gestione, tra cui, a titolo esemplificativo: le commissioni delle piattaforme di prenotazione e dei sistemi di pagamento; i servizi di pulizia, biancheria e lavanderia; i prodotti di cortesia e i materiali di consumo; le manutenzioni di cui all’art. 13; gli Interventi in Loco a carico del Mandante ai sensi dell’art. 14; le eventuali ritenute di legge. Tali importi sono versati mensilmente ai sensi dell’art. 10 e dettagliati nel rendiconto mensile di cui all’art. 4.</w:t>
       </w:r>
     </w:p>
     <w:p>
@@ -2761,10 +2741,7 @@
         <w:jc w:val="both"/>
       </w:pPr>
       <w:r>
-        <w:t>Fatto salvo quanto previsto dal presente articolo e dagli artt. 12, 13, 15 e 16, n</w:t>
-      </w:r>
-      <w:r>
-        <w:t>ull’altro sarà dovuto dal Mandante al Property Manager.</w:t>
+        <w:t xml:space="preserve">Fatto salvo quanto previsto dal presente articolo e dagli artt. 13, 14, 16 e 17, null’altro sarà dovuto dal Mandante al Property Manager.</w:t>
       </w:r>
     </w:p>
     <w:p>
@@ -3044,10 +3021,7 @@
         <w:jc w:val="both"/>
       </w:pPr>
       <w:r>
-        <w:t>Il Mandante comunica per iscritto (anche a mezzo e-mail o messaggistica istantanea) l’approvazione o il rifiuto del preventivo. Solo dopo l’approvazione, l’intervento viene eseguito dai manutentori incaricati dal Property Manager, che ne fattura il relativ</w:t>
-      </w:r>
-      <w:r>
-        <w:t>o importo al Mandante secondo quanto indicato nel preventivo approvato. Tale importo potrà essere trattenuto dalle somme da versare al Mandante ai sensi dell’art. 9.</w:t>
+        <w:t xml:space="preserve">Il Mandante comunica per iscritto (anche a mezzo e-mail o messaggistica istantanea) l’approvazione o il rifiuto del preventivo. Solo dopo l’approvazione, l’intervento viene eseguito dai manutentori incaricati dal Property Manager, che ne fattura il relativo importo al Mandante secondo quanto indicato nel preventivo approvato. Tale importo potrà essere trattenuto dalle somme da versare al Mandante ai sensi dell’art. 10.</w:t>
       </w:r>
     </w:p>
     <w:p>
@@ -3147,13 +3121,7 @@
         <w:jc w:val="both"/>
       </w:pPr>
       <w:r>
-        <w:t>Il costo di ciascun Intervento in Loco è pari a euro ______ per uscita, oltre agli eventuali costi vivi strettamente necessari a consentire l’accesso all’Immobile (a titolo esemplificativo: intervento del fabbro per l’apertura della porta, duplicaz</w:t>
-      </w:r>
-      <w:r>
-        <w:t>ione delle chiavi). La riparazione o sostituzione di serrature, cilindri o dispositivi di accesso è regolata dall’art. 12, salvo che si renda necessaria per fatto del Property Manager o del personale da esso incaricato, nel qual caso è a carico del Propert</w:t>
-      </w:r>
-      <w:r>
-        <w:t>y Manager.</w:t>
+        <w:t xml:space="preserve">Il costo di ciascun Intervento in Loco è pari a euro ______ per uscita, oltre agli eventuali costi vivi strettamente necessari a consentire l’accesso all’Immobile (a titolo esemplificativo: intervento del fabbro per l’apertura della porta, duplicazione delle chiavi). La riparazione o sostituzione di serrature, cilindri o dispositivi di accesso è regolata dall’art. 13, salvo che si renda necessaria per fatto del Property Manager o del personale da esso incaricato, nel qual caso è a carico del Property Manager.</w:t>
       </w:r>
     </w:p>
     <w:p>
@@ -3293,10 +3261,7 @@
         <w:jc w:val="both"/>
       </w:pPr>
       <w:r>
-        <w:t>Gli importi a carico del Mandante ai sensi del presente articolo sono indicati nel rendiconto mensile di cui all’art. 4 e possono</w:t>
-      </w:r>
-      <w:r>
-        <w:t xml:space="preserve"> essere trattenuti dalle somme da versare al Mandante ai sensi dell’art. 9.</w:t>
+        <w:t xml:space="preserve">Gli importi a carico del Mandante ai sensi del presente articolo sono indicati nel rendiconto mensile di cui all’art. 4 e possono essere trattenuti dalle somme da versare al Mandante ai sensi dell’art. 10.</w:t>
       </w:r>
     </w:p>
     <w:p>
@@ -3334,7 +3299,7 @@
         <w:jc w:val="both"/>
       </w:pPr>
       <w:r>
-        <w:t>Il Property Manager dichiara di aver stipulato polizza assicurativa a copertura dei rischi connessi alla propria attività che allega al presente contratto (allegato g).</w:t>
+        <w:t xml:space="preserve">Il Property Manager dichiara di aver stipulato polizza assicurativa a copertura dei rischi connessi alla propria attività che allega al presente contratto (allegato f).</w:t>
       </w:r>
     </w:p>
     <w:p>
@@ -3344,7 +3309,7 @@
         <w:jc w:val="both"/>
       </w:pPr>
       <w:r>
-        <w:t>Il Mandante dichiara di avere stipulato adeguata polizza assicurativa, con primaria compagnia, a copertura dei rischi di incendio (fabbricato e contenuto), furto, responsabilità civile verso i conduttori e verso terzi, che viene allegata al presente contratto (allegato h).</w:t>
+        <w:t xml:space="preserve">Il Mandante dichiara di avere stipulato adeguata polizza assicurativa, con primaria compagnia, a copertura dei rischi di incendio (fabbricato e contenuto), furto, responsabilità civile verso i conduttori e verso terzi, che viene allegata al presente contratto (allegato g).</w:t>
       </w:r>
     </w:p>
     <w:p>
@@ -3472,7 +3437,101 @@
       </w:pPr>
       <w:r>
         <w:rPr/>
-        <w:t xml:space="preserve">In caso di cessazione anticipata del Contratto per fatto imputabile al Mandante prima della scadenza del periodo minimo di durata, ivi compresa la revoca del mandato effettuata in violazione di quanto previsto dal presente articolo o la risoluzione del Contratto per inadempimento del Mandante, saranno a carico del Mandante, oltre a quanto previsto dall’art. 16, le spese sostenute dal </w:t>
+        <w:t xml:space="preserve">In caso di cessazione anticipata del Contratto per fatto imputabile al Mandante prima della scadenza del periodo minimo di durata, ivi compresa la revoca del mandato effettuata in violazione di quanto previsto dal presente articolo o la risoluzione del Contratto per inadempimento del Mandante, saranno a carico del Mandante, oltre a quanto previsto dall’art. 17, le spese sostenute dal Property Manager nella fase di avviamento dell’Immobile e nell’interesse del Mandante, purché documentate e ragionevolmente necessarie o funzionali all’avvio e alla gestione dell’incarico.</w:t>
+      </w:r>
+      <w:proofErr w:type="spellStart"/>
+      <w:proofErr w:type="spellEnd"/>
+    </w:p>
+    <w:p>
+      <w:pPr>
+        <w:pStyle w:val="Corpotesto"/>
+        <w:spacing w:before="120" w:line="360" w:lineRule="auto"/>
+        <w:jc w:val="both"/>
+      </w:pPr>
+      <w:r>
+        <w:t xml:space="preserve">Le prenotazioni in essere alla data di cessazione del Contratto, per qualsiasi causa intervenuta, sono regolate dal successivo art. 17. Restano fermi gli obblighi di rendicontazione e di versamento delle somme maturate fino alla data di cessazione.</w:t>
+      </w:r>
+    </w:p>
+    <w:p>
+      <w:pPr>
+        <w:pStyle w:val="Corpotesto"/>
+        <w:spacing w:before="120"/>
+        <w:rPr>
+          <w:rFonts w:ascii="Microsoft Sans Serif"/>
+        </w:rPr>
+      </w:pPr>
+    </w:p>
+    <w:p>
+      <w:pPr>
+        <w:pStyle w:val="Titolo21"/>
+        <w:numPr>
+          <w:ilvl w:val="0"/>
+          <w:numId w:val="9"/>
+        </w:numPr>
+        <w:tabs>
+          <w:tab w:val="left" w:pos="845"/>
+        </w:tabs>
+        <w:spacing w:before="1"/>
+        <w:ind w:left="0" w:hanging="421"/>
+      </w:pPr>
+      <w:r>
+        <w:t>Prenotazioni in essere alla cessazione del Contratto</w:t>
+      </w:r>
+    </w:p>
+    <w:p>
+      <w:pPr>
+        <w:pStyle w:val="Corpotesto"/>
+        <w:spacing w:before="130" w:line="360" w:lineRule="auto"/>
+        <w:jc w:val="both"/>
+      </w:pPr>
+      <w:r>
+        <w:t xml:space="preserve">Si considerano “Prenotazioni Future” tutte le prenotazioni acquisite nel corso del rapporto per effetto dell’attività del Property Manager, confermate e in essere alla data di cessazione del Contratto, aventi ad oggetto pernottamenti successivi a tale data. Nell’esempio di cui all’art. 16, sono Prenotazioni Future quelle in essere al 31 dicembre per i pernottamenti dal 1° gennaio successivo in poi. In caso di soggiorno a cavallo della data di cessazione, si considerano i soli pernottamenti successivi a tale data.</w:t>
+      </w:r>
+      <w:proofErr w:type="spellStart"/>
+      <w:proofErr w:type="spellEnd"/>
+    </w:p>
+    <w:p>
+      <w:pPr>
+        <w:pStyle w:val="Corpotesto"/>
+        <w:spacing w:before="120" w:line="360" w:lineRule="auto"/>
+        <w:jc w:val="both"/>
+      </w:pPr>
+      <w:r>
+        <w:t xml:space="preserve">A fronte dell’attività di promozione e acquisizione svolta, per le Prenotazioni Future il Mandante riconosce al Property Manager un compenso forfettario (il “Compenso di Fine Mandato”) pari al 30% (trenta per cento) del Costo del Pernottamento, come definito all’art. 11, relativo ai pernottamenti successivi alla data di cessazione.</w:t>
+      </w:r>
+    </w:p>
+    <w:p>
+      <w:pPr>
+        <w:pStyle w:val="Corpotesto"/>
+        <w:spacing w:before="120" w:line="360" w:lineRule="auto"/>
+        <w:jc w:val="both"/>
+        <w:rPr/>
+      </w:pPr>
+      <w:r>
+        <w:t xml:space="preserve">Il Compenso di Fine Mandato </w:t>
+      </w:r>
+      <w:r>
+        <w:t/>
+      </w:r>
+      <w:r>
+        <w:rPr/>
+        <w:t xml:space="preserve">è dovuto con riferimento a tutte le Prenotazioni Future risultanti in essere alla data di cessazione del Contratto, indipendentemente dalla data di effettuazione del relativo soggiorno e dalle modalità con cui il relativo importo sarà successivamente corrisposto dal canale di prenotazione o dall’Ospite.</w:t>
+      </w:r>
+      <w:r>
+        <w:rPr/>
+        <w:t xml:space="preserve"> Esso sarà liquidato entro tale data.</w:t>
+      </w:r>
+    </w:p>
+    <w:p>
+      <w:pPr>
+        <w:pStyle w:val="Corpotesto"/>
+        <w:spacing w:before="120" w:line="360" w:lineRule="auto"/>
+        <w:jc w:val="both"/>
+        <w:rPr/>
+      </w:pPr>
+      <w:r>
+        <w:rPr/>
+        <w:t xml:space="preserve">Entro la data di cessazione del Contratto, il </w:t>
       </w:r>
       <w:proofErr w:type="spellStart"/>
       <w:r>
@@ -3482,7 +3541,7 @@
       <w:proofErr w:type="spellEnd"/>
       <w:r>
         <w:rPr/>
-        <w:t xml:space="preserve"> Manager nella fase di avviamento dell’Immobile e nell’interesse del Mandante, purché documentate e ragionevolmente necessarie o funzionali all’avvio e alla gestione dell’incarico.</w:t>
+        <w:t xml:space="preserve"> Manager trasmetterà al Mandante un prospetto riepilogativo delle Prenotazioni Future, con indicazione delle relative date, degli importi e del Compenso di Fine Mandato dovuto, ed emetterà la relativa fattura. Le eventuali Prenotazioni Future acquisite o confermate successivamente alla trasmissione del prospetto e comunque entro la data di cessazione del Contratto saranno oggetto di successivo conguaglio, da effettuarsi entro 10 (dieci) giorni dalla data di cessazione.</w:t>
       </w:r>
     </w:p>
     <w:p>
@@ -3490,176 +3549,52 @@
         <w:pStyle w:val="Corpotesto"/>
         <w:spacing w:before="120" w:line="360" w:lineRule="auto"/>
         <w:jc w:val="both"/>
-      </w:pPr>
-      <w:r>
-        <w:t>Le prenotazioni in essere alla data di cessazione del Contratto, per qualsiasi causa intervenuta, sono regolate dal successivo art. 16. Restano fermi gli obblighi di rendicontazione e di versamento d</w:t>
-      </w:r>
-      <w:r>
-        <w:t>elle somme maturate fino alla data di cessazione.</w:t>
-      </w:r>
-    </w:p>
-    <w:p>
-      <w:pPr>
-        <w:pStyle w:val="Corpotesto"/>
-        <w:spacing w:before="120"/>
-        <w:rPr>
-          <w:rFonts w:ascii="Microsoft Sans Serif"/>
-        </w:rPr>
-      </w:pPr>
-    </w:p>
-    <w:p>
-      <w:pPr>
-        <w:pStyle w:val="Titolo21"/>
-        <w:numPr>
-          <w:ilvl w:val="0"/>
-          <w:numId w:val="9"/>
-        </w:numPr>
-        <w:tabs>
-          <w:tab w:val="left" w:pos="845"/>
-        </w:tabs>
-        <w:spacing w:before="1"/>
-        <w:ind w:left="0" w:hanging="421"/>
-      </w:pPr>
-      <w:r>
-        <w:t>Prenotazioni in essere alla cessazione del Contratto</w:t>
-      </w:r>
-    </w:p>
-    <w:p>
-      <w:pPr>
-        <w:pStyle w:val="Corpotesto"/>
-        <w:spacing w:before="130" w:line="360" w:lineRule="auto"/>
-        <w:jc w:val="both"/>
-      </w:pPr>
-      <w:r>
-        <w:t>Si considerano “</w:t>
-      </w:r>
-      <w:r>
-        <w:rPr>
-          <w:b/>
-        </w:rPr>
-        <w:t>Prenotazioni Future</w:t>
-      </w:r>
-      <w:r>
-        <w:t xml:space="preserve">” tutte le prenotazioni acquisite nel corso del rapporto </w:t>
-      </w:r>
-      <w:r>
-        <w:t xml:space="preserve"/>
-      </w:r>
-      <w:r>
         <w:rPr/>
-        <w:t>per effetto</w:t>
-      </w:r>
-      <w:r>
-        <w:t xml:space="preserve"> del</w:t>
-      </w:r>
-      <w:r>
-        <w:t xml:space="preserve">l’attività del </w:t>
+      </w:pPr>
+      <w:r>
+        <w:rPr/>
+        <w:t xml:space="preserve">Il Compenso di Fine Mandato è determinato in via forfettaria anche in considerazione del rischio di successive cancellazioni, modifiche, riduzioni del soggiorno o mancata presentazione dell’Ospite. Pertanto, una volta maturato il diritto al Compenso di Fine Mandato, eventuali cancellazioni, modifiche, riduzioni o mancati soggiorni relativi alle Prenotazioni Future non comporteranno alcun obbligo del </w:t>
       </w:r>
       <w:proofErr w:type="spellStart"/>
       <w:r>
+        <w:rPr/>
         <w:t>Property</w:t>
       </w:r>
       <w:proofErr w:type="spellEnd"/>
       <w:r>
-        <w:t xml:space="preserve"> Manager, confermate e in essere</w:t>
-      </w:r>
-      <w:r>
-        <w:t xml:space="preserve"> </w:t>
-      </w:r>
-      <w:r>
         <w:rPr/>
-        <w:t xml:space="preserve">alla data di cessazione del Contratto, </w:t>
-      </w:r>
-      <w:r>
-        <w:rPr/>
-        <w:t xml:space="preserve">aventi ad oggetto </w:t>
-      </w:r>
-      <w:r>
-        <w:t>pernottamenti successivi a tale data.</w:t>
+        <w:t xml:space="preserve"> Manager di restituzione, totale o parziale, del compenso già maturato.</w:t>
+      </w:r>
+    </w:p>
+    <w:p>
+      <w:pPr>
+        <w:pStyle w:val="Corpotesto"/>
+        <w:spacing w:before="120" w:line="360" w:lineRule="auto"/>
+        <w:jc w:val="both"/>
+      </w:pPr>
+      <w:r>
+        <w:t>Dalla data di cessazione, la gestione delle Prenotazioni Future (accoglienza, puliz</w:t>
+      </w:r>
+      <w:r>
+        <w:t xml:space="preserve">ie, assistenza agli Ospiti e relativi adempimenti amministrativi e fiscali) passa al Mandante, direttamente o tramite terzi da lui incaricati, </w:t>
+      </w:r>
+      <w:r>
+        <w:lastRenderedPageBreak/>
+        <w:t xml:space="preserve">che ne assume ogni onere e responsabilità nei confronti degli </w:t>
+      </w:r>
+      <w:r>
+        <w:t>Ospiti</w:t>
+      </w:r>
+      <w:r>
+        <w:t>.</w:t>
       </w:r>
       <w:r>
         <w:rPr/>
         <w:t xml:space="preserve"> </w:t>
       </w:r>
       <w:r>
-        <w:t>Nell’esempio di cui all’art. 15, sono Preno</w:t>
-      </w:r>
-      <w:r>
-        <w:t>tazioni Future quelle in essere al 31 dicembre per i pernottamenti dal 1° gennaio successivo in poi. In caso di soggiorno a cavallo della data di cessazione, si considerano i soli pernottamenti successivi a tale data.</w:t>
-      </w:r>
-    </w:p>
-    <w:p>
-      <w:pPr>
-        <w:pStyle w:val="Corpotesto"/>
-        <w:spacing w:before="120" w:line="360" w:lineRule="auto"/>
-        <w:jc w:val="both"/>
-      </w:pPr>
-      <w:r>
-        <w:t>A fronte dell’attività di promozione e</w:t>
-      </w:r>
-      <w:r>
-        <w:t xml:space="preserve"> acquisizione svolta, per le Prenotazioni Future il Mandante riconosce al Property Manager un compenso forfettario (il “</w:t>
-      </w:r>
-      <w:r>
-        <w:rPr>
-          <w:b/>
-        </w:rPr>
-        <w:t>Compenso di Fine Mandato</w:t>
-      </w:r>
-      <w:r>
-        <w:t xml:space="preserve">”) </w:t>
-      </w:r>
-      <w:r>
-        <w:rPr>
-          <w:b/>
-        </w:rPr>
-        <w:t>pari al 30% (trenta per cento) del Costo del Pernottamento</w:t>
-      </w:r>
-      <w:r>
-        <w:t>, come definito all’art. 10, relativo ai pernottame</w:t>
-      </w:r>
-      <w:r>
-        <w:t>nti suc</w:t>
-      </w:r>
-      <w:r>
-        <w:t>cessivi alla data di cessazione</w:t>
-      </w:r>
-      <w:r>
-        <w:t>.</w:t>
-      </w:r>
-    </w:p>
-    <w:p>
-      <w:pPr>
-        <w:pStyle w:val="Corpotesto"/>
-        <w:spacing w:before="120" w:line="360" w:lineRule="auto"/>
-        <w:jc w:val="both"/>
         <w:rPr/>
-      </w:pPr>
-      <w:r>
-        <w:t xml:space="preserve">Il Compenso di Fine Mandato </w:t>
-      </w:r>
-      <w:r>
-        <w:t/>
-      </w:r>
-      <w:r>
-        <w:rPr/>
-        <w:t xml:space="preserve">è dovuto con riferimento a tutte le Prenotazioni Future risultanti in essere alla data di cessazione del Contratto, indipendentemente dalla data di effettuazione del relativo soggiorno e dalle modalità con cui il relativo importo sarà successivamente corrisposto dal canale di prenotazione o dall’Ospite.</w:t>
-      </w:r>
-      <w:r>
-        <w:rPr/>
-        <w:t xml:space="preserve"> Esso sarà liquidato entro tale data.</w:t>
-      </w:r>
-    </w:p>
-    <w:p>
-      <w:pPr>
-        <w:pStyle w:val="Corpotesto"/>
-        <w:spacing w:before="120" w:line="360" w:lineRule="auto"/>
-        <w:jc w:val="both"/>
-        <w:rPr/>
-      </w:pPr>
-      <w:r>
-        <w:rPr/>
-        <w:t xml:space="preserve">Entro la data di cessazione del Contratto, il </w:t>
+        <w:t xml:space="preserve">Il </w:t>
       </w:r>
       <w:proofErr w:type="spellStart"/>
       <w:r>
@@ -3669,69 +3604,6 @@
       <w:proofErr w:type="spellEnd"/>
       <w:r>
         <w:rPr/>
-        <w:t xml:space="preserve"> Manager trasmetterà al Mandante un prospetto riepilogativo delle Prenotazioni Future, con indicazione delle relative date, degli importi e del Compenso di Fine Mandato dovuto, ed emetterà la relativa fattura. Le eventuali Prenotazioni Future acquisite o confermate successivamente alla trasmissione del prospetto e comunque entro la data di cessazione del Contratto saranno oggetto di successivo conguaglio, da effettuarsi entro 10 (dieci) giorni dalla data di cessazione.</w:t>
-      </w:r>
-    </w:p>
-    <w:p>
-      <w:pPr>
-        <w:pStyle w:val="Corpotesto"/>
-        <w:spacing w:before="120" w:line="360" w:lineRule="auto"/>
-        <w:jc w:val="both"/>
-        <w:rPr/>
-      </w:pPr>
-      <w:r>
-        <w:rPr/>
-        <w:t xml:space="preserve">Il Compenso di Fine Mandato è determinato in via forfettaria anche in considerazione del rischio di successive cancellazioni, modifiche, riduzioni del soggiorno o mancata presentazione dell’Ospite. Pertanto, una volta maturato il diritto al Compenso di Fine Mandato, eventuali cancellazioni, modifiche, riduzioni o mancati soggiorni relativi alle Prenotazioni Future non comporteranno alcun obbligo del </w:t>
-      </w:r>
-      <w:proofErr w:type="spellStart"/>
-      <w:r>
-        <w:rPr/>
-        <w:t>Property</w:t>
-      </w:r>
-      <w:proofErr w:type="spellEnd"/>
-      <w:r>
-        <w:rPr/>
-        <w:t xml:space="preserve"> Manager di restituzione, totale o parziale, del compenso già maturato.</w:t>
-      </w:r>
-    </w:p>
-    <w:p>
-      <w:pPr>
-        <w:pStyle w:val="Corpotesto"/>
-        <w:spacing w:before="120" w:line="360" w:lineRule="auto"/>
-        <w:jc w:val="both"/>
-      </w:pPr>
-      <w:r>
-        <w:t>Dalla data di cessazione, la gestione delle Prenotazioni Future (accoglienza, puliz</w:t>
-      </w:r>
-      <w:r>
-        <w:t xml:space="preserve">ie, assistenza agli Ospiti e relativi adempimenti amministrativi e fiscali) passa al Mandante, direttamente o tramite terzi da lui incaricati, </w:t>
-      </w:r>
-      <w:r>
-        <w:lastRenderedPageBreak/>
-        <w:t xml:space="preserve">che ne assume ogni onere e responsabilità nei confronti degli </w:t>
-      </w:r>
-      <w:r>
-        <w:t>Ospiti</w:t>
-      </w:r>
-      <w:r>
-        <w:t>.</w:t>
-      </w:r>
-      <w:r>
-        <w:rPr/>
-        <w:t xml:space="preserve"> </w:t>
-      </w:r>
-      <w:r>
-        <w:rPr/>
-        <w:t xml:space="preserve">Il </w:t>
-      </w:r>
-      <w:proofErr w:type="spellStart"/>
-      <w:r>
-        <w:rPr/>
-        <w:t>Property</w:t>
-      </w:r>
-      <w:proofErr w:type="spellEnd"/>
-      <w:r>
-        <w:rPr/>
         <w:t xml:space="preserve"> Manager non sarà pertanto responsabile degli obblighi e degli adempimenti relativi alla gestione dei soggiorni successivi alla cessazione del Contratto</w:t>
       </w:r>
       <w:r>
@@ -3821,7 +3693,7 @@
         <w:jc w:val="both"/>
       </w:pPr>
       <w:r>
-        <w:t>Il Compenso di Fine Mandato non è dovuto in caso di risoluzione del Contratto per inadempimento del Property Manager ai sensi dell’art. 17.</w:t>
+        <w:t xml:space="preserve">Il Compenso di Fine Mandato non è dovuto in caso di risoluzione del Contratto per inadempimento del Property Manager ai sensi dell’art. 18.</w:t>
       </w:r>
     </w:p>
     <w:p>
@@ -4437,23 +4309,6 @@
       </w:pPr>
       <w:r>
         <w:t>Dichiarazioni di conformità degli impianti;</w:t>
-      </w:r>
-    </w:p>
-    <w:p>
-      <w:pPr>
-        <w:pStyle w:val="Paragrafoelenco"/>
-        <w:numPr>
-          <w:ilvl w:val="0"/>
-          <w:numId w:val="2"/>
-        </w:numPr>
-        <w:tabs>
-          <w:tab w:val="left" w:pos="675"/>
-        </w:tabs>
-        <w:spacing w:before="130"/>
-        <w:ind w:left="0" w:hanging="251"/>
-      </w:pPr>
-      <w:r>
-        <w:t>Tabella compensi e spese;</w:t>
       </w:r>
     </w:p>
     <w:p>
@@ -4631,7 +4486,7 @@
         <w:ind w:left="360"/>
       </w:pPr>
       <w:r>
-        <w:t>11) Responsabilità del Property Manager e sue limitazioni;</w:t>
+        <w:t xml:space="preserve">12) Responsabilità del Property Manager e sue limitazioni;</w:t>
       </w:r>
     </w:p>
     <w:p>
@@ -4641,7 +4496,7 @@
         <w:ind w:left="360"/>
       </w:pPr>
       <w:r>
-        <w:t>12) Manutenzione dell’Immobile;</w:t>
+        <w:t xml:space="preserve">13) Manutenzione dell’Immobile;</w:t>
       </w:r>
     </w:p>
     <w:p>
@@ -4651,7 +4506,7 @@
         <w:ind w:left="360"/>
       </w:pPr>
       <w:r>
-        <w:t>13) Interventi in loco e accesso degli Ospiti;</w:t>
+        <w:t xml:space="preserve">14) Interventi in loco e accesso degli Ospiti;</w:t>
       </w:r>
     </w:p>
     <w:p>
@@ -4661,7 +4516,7 @@
         <w:ind w:left="360"/>
       </w:pPr>
       <w:r>
-        <w:t>15) Durata e recesso;</w:t>
+        <w:t xml:space="preserve">16) Durata e recesso;</w:t>
       </w:r>
     </w:p>
     <w:p>
@@ -4671,7 +4526,7 @@
         <w:ind w:left="360"/>
       </w:pPr>
       <w:r>
-        <w:t>16) Prenotazioni in essere alla cessazione del Contratto;</w:t>
+        <w:t xml:space="preserve">17) Prenotazioni in essere alla cessazione del Contratto;</w:t>
       </w:r>
     </w:p>
     <w:p>
@@ -4681,7 +4536,7 @@
         <w:ind w:left="360"/>
       </w:pPr>
       <w:r>
-        <w:t>17) Clausola risolutiva espressa;</w:t>
+        <w:t xml:space="preserve">18) Clausola risolutiva espressa;</w:t>
       </w:r>
       <w:bookmarkStart w:id="29" w:name="_GoBack"/>
       <w:bookmarkEnd w:id="29"/>
@@ -4693,7 +4548,7 @@
         <w:ind w:left="360"/>
       </w:pPr>
       <w:r>
-        <w:t>20) Controversie.</w:t>
+        <w:t xml:space="preserve">21) Controversie.</w:t>
       </w:r>
     </w:p>
     <w:p>

</xml_diff>

<commit_message>
Revisione contratto: art. 6 (prezzi dinamici, spese), check-in/out da remoto, avviamento 500 euro, interventi in loco, assicurazione, allegati
Co-Authored-By: Claude Opus 5.5 <noreply@anthropic.com>
Claude-Session: https://claude.ai/code/session_01WggD5zVqy5TCJTD9M5VXmn
</commit_message>
<xml_diff>
--- a/contratti/Contratto_Mandato_BB_Hospitality_def.docx
+++ b/contratti/Contratto_Mandato_BB_Hospitality_def.docx
@@ -489,28 +489,6 @@
       </w:pPr>
       <w:r>
         <w:t>Il Mandante dichiara e garantisce che l’immobile e gli impianti  sono in regola con le vigenti norme di legge e, anche a tal fine, allega:</w:t>
-      </w:r>
-    </w:p>
-    <w:p>
-      <w:pPr>
-        <w:pStyle w:val="Paragrafoelenco"/>
-        <w:numPr>
-          <w:ilvl w:val="0"/>
-          <w:numId w:val="13"/>
-        </w:numPr>
-        <w:tabs>
-          <w:tab w:val="left" w:pos="682"/>
-        </w:tabs>
-        <w:spacing w:line="250" w:lineRule="exact"/>
-      </w:pPr>
-      <w:r>
-        <w:t xml:space="preserve">Piantina </w:t>
-      </w:r>
-      <w:r>
-        <w:rPr>
-          <w:spacing w:val="-2"/>
-        </w:rPr>
-        <w:t>catastale;</w:t>
       </w:r>
     </w:p>
     <w:p>
@@ -571,30 +549,6 @@
         </w:tabs>
         <w:spacing w:before="126"/>
       </w:pPr>
-      <w:hyperlink w:anchor="_bookmark3" w:history="1">
-        <w:r>
-          <w:t xml:space="preserve">Dichiarazioni di conformità degli </w:t>
-        </w:r>
-        <w:r>
-          <w:rPr>
-            <w:spacing w:val="-2"/>
-          </w:rPr>
-          <w:t>impianti;</w:t>
-        </w:r>
-      </w:hyperlink>
-    </w:p>
-    <w:p>
-      <w:pPr>
-        <w:pStyle w:val="Paragrafoelenco"/>
-        <w:numPr>
-          <w:ilvl w:val="0"/>
-          <w:numId w:val="13"/>
-        </w:numPr>
-        <w:tabs>
-          <w:tab w:val="left" w:pos="682"/>
-        </w:tabs>
-        <w:spacing w:before="126"/>
-      </w:pPr>
       <w:r>
         <w:t>Certificazioni relative alle dotazioni di sicurezza obbligatorie per legge (rilevatori di gas ed estintori).</w:t>
       </w:r>
@@ -1140,7 +1094,7 @@
         <w:rPr>
           <w:color w:val="000009"/>
         </w:rPr>
-        <w:t xml:space="preserve">determinare, di concerto con il Mandante, i corrispettivi da richiedere agli Ospiti (distinti fra quota relativa alla locazione dell’Immobile e quota relativa ai servizi che il Property Manager fornisce direttamente agli Ospiti), tenuto conto della durata del soggiorno, della stagione e del numero di occupanti;</w:t>
+        <w:t xml:space="preserve">determinare i corrispettivi da richiedere agli Ospiti (distinti fra quota relativa alla locazione dell’Immobile e quota relativa ai servizi che il Property Manager fornisce direttamente agli Ospiti), secondo quanto previsto dall’art. 6;</w:t>
       </w:r>
     </w:p>
     <w:p>
@@ -1571,7 +1525,7 @@
         <w:rPr>
           <w:i/>
         </w:rPr>
-        <w:t xml:space="preserve">check-in degli Ospiti, svolto da remoto nel rispetto della normativa italiana vigente in materia di identificazione degli alloggiati, ivi compreso l’obbligo di riconoscimento de visu ove previsto, anche mediante strumenti di identificazione a distanza conformi a tale normativa; invio delle istruzioni di accesso all’Immobile e del vademecum di cui alla lettera a) del presente comma; nonché riscossione dell’imposta di soggiorno con contestuale emissione della relativa ricevuta e acquisizione dei documenti di identità degli alloggiati per la comunicazione alla Questura;</w:t>
+        <w:t xml:space="preserve">check-in degli Ospiti, svolto da remoto nel rispetto della normativa italiana vigente in materia di identificazione degli alloggiati, ivi compreso l’obbligo di riconoscimento de visu, anche mediante strumenti di identificazione a distanza conformi a tale normativa e un sistema di videosorveglianza installato all’esterno dell’ingresso dell’Immobile, a cura e spese del Mandante e nel rispetto della normativa in materia di protezione dei dati personali; invio delle istruzioni di accesso all’Immobile e del vademecum di cui alla lettera a) del presente comma; nonché riscossione dell’imposta di soggiorno con contestuale emissione della relativa ricevuta e acquisizione dei documenti di identità degli alloggiati per la comunicazione alla Questura;</w:t>
       </w:r>
     </w:p>
     <w:p>
@@ -1609,16 +1563,7 @@
         <w:jc w:val="both"/>
       </w:pPr>
       <w:r>
-        <w:t xml:space="preserve">al </w:t>
-      </w:r>
-      <w:r>
-        <w:rPr>
-          <w:i/>
-        </w:rPr>
-        <w:t>check-out</w:t>
-      </w:r>
-      <w:r>
-        <w:t xml:space="preserve"> alla fine del soggiorno, alla verifica dell’Immobile ed al ritiro delle chiavi;</w:t>
+        <w:t xml:space="preserve">check-out degli Ospiti, svolto da remoto al termine del soggiorno; la verifica dello stato dell’Immobile è effettuata dal personale addetto alle pulizie, che segnala al Property Manager eventuali danni, ammanchi o anomalie;</w:t>
       </w:r>
     </w:p>
     <w:p>
@@ -2020,7 +1965,7 @@
         <w:jc w:val="both"/>
       </w:pPr>
       <w:r>
-        <w:t xml:space="preserve">Il canone di ciascuna locazione breve è determinato dal Property Manager, di concerto con il Mandante, in base alla stagionalità, al numero degli occupanti e alla durata del soggiorno, applicando una tariffa giornaliera per i giorni di effettiva locazione dell’Immobile.</w:t>
+        <w:t xml:space="preserve">Il canone di ciascuna locazione breve è determinato dal Property Manager secondo logiche di prezzo dinamico, in base alla stagionalità, alla domanda, al numero degli occupanti e alla durata del soggiorno. Prima dell’avvio della gestione le Parti concordano per iscritto un prezzo minimo per notte, determinato in base ai costi effettivi dell’Immobile e al suo posizionamento sul mercato, al di sotto del quale il Property Manager non può scendere senza il preventivo consenso del Mandante. Il prezzo minimo può essere aggiornato in qualsiasi momento per iscritto, anche a mezzo e-mail.</w:t>
       </w:r>
     </w:p>
     <w:p>
@@ -2030,7 +1975,7 @@
         <w:jc w:val="both"/>
       </w:pPr>
       <w:r>
-        <w:t xml:space="preserve">Per le locazioni a breve termine, il canone è comprensivo del rimborso delle spese condominiali ordinarie, della Tassa Rifiuti e delle Utenze (elettricità, gas, internet, ecc.) dell’Immobile, oltre a qualsiasi altra spesa / imposta / tassa non espressamente indicata nel presente Contratto.</w:t>
+        <w:t xml:space="preserve">Tutte le spese relative all’Immobile, ivi comprese le spese condominiali, la Tassa Rifiuti, le utenze (elettricità, gas, acqua, internet, ecc.) e ogni altra imposta o tassa relativa all’Immobile, sono a carico del Mandante. Il Property Manager non sostiene alcuna spesa relativa all’Immobile.</w:t>
       </w:r>
       <w:bookmarkStart w:id="7" w:name="Per_le_locazioni_a_breve_termine,_il_can"/>
       <w:bookmarkEnd w:id="7"/>
@@ -2695,7 +2640,7 @@
         <w:jc w:val="both"/>
       </w:pPr>
       <w:r>
-        <w:t>E’ espressamente pattuito fra le parti che il Mandante riconoscerà al Property Manager un compenso per le pratiche iniziali sia burocratiche sia pubblicitarie pari ad euro ______.</w:t>
+        <w:t xml:space="preserve">Le attività di avviamento svolte dal Property Manager (a titolo esemplificativo: servizio fotografico, creazione e ottimizzazione degli annunci, pratiche amministrative iniziali, consulenza per l’allestimento) hanno un valore convenzionalmente determinato in euro 500,00 (cinquecento/00) oltre IVA. Tale importo non è dovuto dal Mandante, salvo il caso di cessazione anticipata del Contratto prima che sia decorso 1 (un) anno dalla sua sottoscrizione, secondo quanto previsto dall’art. 16.</w:t>
       </w:r>
     </w:p>
     <w:p>
@@ -3092,26 +3037,7 @@
         <w:jc w:val="both"/>
       </w:pPr>
       <w:r>
-        <w:t>Per “</w:t>
-      </w:r>
-      <w:r>
-        <w:rPr>
-          <w:b/>
-        </w:rPr>
-        <w:t>Intervento in Loco</w:t>
-      </w:r>
-      <w:r>
-        <w:t>” si intende l’uscita presso l’Immobile del Property Manager o di personale da esso incaricato, al di fuori delle attività programmate (chec</w:t>
-      </w:r>
-      <w:r>
-        <w:t xml:space="preserve">k-in, pulizie, check-out), resa necessaria da problemi </w:t>
-      </w:r>
-      <w:r>
-        <w:lastRenderedPageBreak/>
-        <w:t>di accesso degli Ospiti all’Immobile. Il Property Manager garantisce l’esecuzione dell’Intervento in Loco nel più breve tempo possibile, compatibilmente con i tempi tecnici necessari a raggiungere l’Im</w:t>
-      </w:r>
-      <w:r>
-        <w:t>mobile.</w:t>
+        <w:t xml:space="preserve">Per “Intervento in Loco” si intende l’uscita presso l’Immobile del Property Manager o di personale da esso incaricato, al di fuori delle attività programmate (check-in, pulizie, check-out). In caso di problemi di accesso degli Ospiti all’Immobile, il Property Manager garantisce l’esecuzione dell’Intervento in Loco nel più breve tempo possibile, compatibilmente con i tempi tecnici necessari a raggiungere l’Immobile.</w:t>
       </w:r>
     </w:p>
     <w:p>
@@ -3121,7 +3047,7 @@
         <w:jc w:val="both"/>
       </w:pPr>
       <w:r>
-        <w:t xml:space="preserve">Il costo di ciascun Intervento in Loco è pari a euro ______ per uscita, oltre agli eventuali costi vivi strettamente necessari a consentire l’accesso all’Immobile (a titolo esemplificativo: intervento del fabbro per l’apertura della porta, duplicazione delle chiavi). La riparazione o sostituzione di serrature, cilindri o dispositivi di accesso è regolata dall’art. 13, salvo che si renda necessaria per fatto del Property Manager o del personale da esso incaricato, nel qual caso è a carico del Property Manager.</w:t>
+        <w:t xml:space="preserve">Il Property Manager garantisce, senza costi aggiuntivi per il Mandante, 1 (un) Intervento in Loco al mese per il normale controllo dello stato dell’Immobile. Ogni ulteriore Intervento in Loco, ivi compresi quelli relativi all’allestimento e all’arredamento iniziale dell’Immobile, alla presenza durante lavori di ristrutturazione o manutenzione o a qualsiasi altro intervento legato all’Immobile, ha un costo di euro 50,00 (cinquanta/00) oltre IVA per uscita, oltre agli eventuali costi vivi strettamente necessari (a titolo esemplificativo: intervento del fabbro per l’apertura della porta, duplicazione delle chiavi), salvo quanto previsto dai commi seguenti per gli Interventi in Loco resi necessari da problemi di accesso degli Ospiti. La riparazione o sostituzione di serrature, cilindri o dispositivi di accesso è regolata dall’art. 13, salvo che si renda necessaria per fatto del Property Manager o del personale da esso incaricato, nel qual caso è a carico del Property Manager.</w:t>
       </w:r>
     </w:p>
     <w:p>
@@ -3299,7 +3225,7 @@
         <w:jc w:val="both"/>
       </w:pPr>
       <w:r>
-        <w:t xml:space="preserve">Il Property Manager dichiara di aver stipulato polizza assicurativa a copertura dei rischi connessi alla propria attività che allega al presente contratto (allegato f).</w:t>
+        <w:t xml:space="preserve">Il Property Manager si impegna a stipulare una polizza assicurativa a copertura dei rischi connessi alla propria attività e a trasmetterne copia al Mandante con successiva comunicazione a mezzo e-mail.</w:t>
       </w:r>
     </w:p>
     <w:p>
@@ -3309,7 +3235,7 @@
         <w:jc w:val="both"/>
       </w:pPr>
       <w:r>
-        <w:t xml:space="preserve">Il Mandante dichiara di avere stipulato adeguata polizza assicurativa, con primaria compagnia, a copertura dei rischi di incendio (fabbricato e contenuto), furto, responsabilità civile verso i conduttori e verso terzi, che viene allegata al presente contratto (allegato g).</w:t>
+        <w:t xml:space="preserve">Il Mandante dichiara di avere stipulato adeguata polizza assicurativa, con primaria compagnia, a copertura dei rischi di incendio (fabbricato e contenuto), furto, responsabilità civile verso i conduttori e verso terzi, che viene allegata al presente contratto (allegato d).</w:t>
       </w:r>
     </w:p>
     <w:p>
@@ -3395,37 +3321,7 @@
         <w:jc w:val="both"/>
       </w:pPr>
       <w:r>
-        <w:t>Al fine di consentire al Property Manager di recuperare gli investimenti sostenuti nell</w:t>
-      </w:r>
-      <w:r>
-        <w:t xml:space="preserve">a fase di avviamento dell’Immobile (a titolo esemplificativo: servizio fotografico, creazione e ottimizzazione degli annunci, pratiche amministrative iniziali, consulenza per l’allestimento), le Parti convengono una </w:t>
-      </w:r>
-      <w:r>
-        <w:rPr>
-          <w:b/>
-        </w:rPr>
-        <w:t>durata minima garantita del Contratto di</w:t>
-      </w:r>
-      <w:r>
-        <w:rPr>
-          <w:b/>
-        </w:rPr>
-        <w:t xml:space="preserve"> 6 (sei) mesi</w:t>
-      </w:r>
-      <w:r>
-        <w:t xml:space="preserve"> dalla data di sottoscrizione. Pertanto il recesso </w:t>
-      </w:r>
-      <w:r>
-        <w:rPr>
-          <w:b/>
-        </w:rPr>
-        <w:t>non può essere comunicato prima che siano decorsi 4 (quattro) mesi</w:t>
-      </w:r>
-      <w:r>
-        <w:t xml:space="preserve"> dalla data di sottoscrizione; l’eventuale comunicazione pervenuta prima di tale termine si intenderà ricevuta il giorno succe</w:t>
-      </w:r>
-      <w:r>
-        <w:t>ssivo alla sua scadenza. In ogni caso il Contratto non potrà cessare per recesso prima che siano decorsi 6 (sei) mesi dalla sua sottoscrizione.</w:t>
+        <w:t xml:space="preserve">Le Parti convengono una durata minima del Contratto di 6 (sei) mesi dalla data di sottoscrizione. Pertanto il recesso non può essere comunicato prima che siano decorsi 4 (quattro) mesi dalla sottoscrizione; l’eventuale comunicazione pervenuta prima di tale termine si intenderà ricevuta il giorno successivo alla sua scadenza. In ogni caso il Contratto non potrà cessare per recesso prima che siano decorsi 6 (sei) mesi dalla sua sottoscrizione. Qualora il Contratto cessi per recesso del Mandante, o per risoluzione dovuta a inadempimento del Mandante, prima che sia decorso 1 (un) anno dalla sottoscrizione, il Mandante corrisponderà al Property Manager il rimborso forfettario dei costi di avviamento pari a euro 500,00 (cinquecento/00) oltre IVA, di cui all’art. 11.</w:t>
       </w:r>
     </w:p>
     <w:p>
@@ -3437,7 +3333,7 @@
       </w:pPr>
       <w:r>
         <w:rPr/>
-        <w:t xml:space="preserve">In caso di cessazione anticipata del Contratto per fatto imputabile al Mandante prima della scadenza del periodo minimo di durata, ivi compresa la revoca del mandato effettuata in violazione di quanto previsto dal presente articolo o la risoluzione del Contratto per inadempimento del Mandante, saranno a carico del Mandante, oltre a quanto previsto dall’art. 17, le spese sostenute dal Property Manager nella fase di avviamento dell’Immobile e nell’interesse del Mandante, purché documentate e ragionevolmente necessarie o funzionali all’avvio e alla gestione dell’incarico.</w:t>
+        <w:t xml:space="preserve">Il rimborso forfettario di cui al comma precedente non è dovuto qualora il Contratto cessi per recesso del Property Manager o per risoluzione dovuta a inadempimento del Property Manager. Può essere trattenuto dalle somme da versare al Mandante ai sensi dell’art. 10.</w:t>
       </w:r>
       <w:proofErr w:type="spellStart"/>
       <w:proofErr w:type="spellEnd"/>
@@ -4251,13 +4147,13 @@
           <w:numId w:val="2"/>
         </w:numPr>
         <w:tabs>
-          <w:tab w:val="left" w:pos="681"/>
-        </w:tabs>
-        <w:spacing w:before="127"/>
-        <w:ind w:left="0" w:hanging="257"/>
-      </w:pPr>
-      <w:r>
-        <w:t>Piantina catastale;</w:t>
+          <w:tab w:val="left" w:pos="682"/>
+        </w:tabs>
+        <w:spacing w:before="130"/>
+        <w:ind w:left="0" w:hanging="258"/>
+      </w:pPr>
+      <w:r>
+        <w:t>Visura Catastale;</w:t>
       </w:r>
     </w:p>
     <w:p>
@@ -4268,13 +4164,13 @@
           <w:numId w:val="2"/>
         </w:numPr>
         <w:tabs>
-          <w:tab w:val="left" w:pos="682"/>
+          <w:tab w:val="left" w:pos="658"/>
         </w:tabs>
         <w:spacing w:before="130"/>
-        <w:ind w:left="0" w:hanging="258"/>
-      </w:pPr>
-      <w:r>
-        <w:t>Visura Catastale;</w:t>
+        <w:ind w:left="0" w:hanging="234"/>
+      </w:pPr>
+      <w:r>
+        <w:t>Attestato di Prestazione Energetica (A.P.E.);</w:t>
       </w:r>
     </w:p>
     <w:p>
@@ -4285,64 +4181,13 @@
           <w:numId w:val="2"/>
         </w:numPr>
         <w:tabs>
-          <w:tab w:val="left" w:pos="658"/>
-        </w:tabs>
-        <w:spacing w:before="130"/>
-        <w:ind w:left="0" w:hanging="234"/>
-      </w:pPr>
-      <w:r>
-        <w:t>Attestato di Prestazione Energetica (A.P.E.);</w:t>
-      </w:r>
-    </w:p>
-    <w:p>
-      <w:pPr>
-        <w:pStyle w:val="Paragrafoelenco"/>
-        <w:numPr>
-          <w:ilvl w:val="0"/>
-          <w:numId w:val="2"/>
-        </w:numPr>
-        <w:tabs>
           <w:tab w:val="left" w:pos="682"/>
         </w:tabs>
         <w:spacing w:before="130"/>
         <w:ind w:left="0" w:hanging="258"/>
       </w:pPr>
       <w:r>
-        <w:t>Dichiarazioni di conformità degli impianti;</w:t>
-      </w:r>
-    </w:p>
-    <w:p>
-      <w:pPr>
-        <w:pStyle w:val="Paragrafoelenco"/>
-        <w:numPr>
-          <w:ilvl w:val="0"/>
-          <w:numId w:val="2"/>
-        </w:numPr>
-        <w:tabs>
-          <w:tab w:val="left" w:pos="616"/>
-        </w:tabs>
-        <w:spacing w:before="131"/>
-        <w:ind w:left="0" w:hanging="192"/>
-      </w:pPr>
-      <w:r>
-        <w:t>Tabella informativa sui flussi di cassa;</w:t>
-      </w:r>
-    </w:p>
-    <w:p>
-      <w:pPr>
-        <w:pStyle w:val="Paragrafoelenco"/>
-        <w:numPr>
-          <w:ilvl w:val="0"/>
-          <w:numId w:val="2"/>
-        </w:numPr>
-        <w:tabs>
-          <w:tab w:val="left" w:pos="682"/>
-        </w:tabs>
-        <w:spacing w:before="130"/>
-        <w:ind w:left="0" w:hanging="258"/>
-      </w:pPr>
-      <w:r>
-        <w:t>Polizza assicurativa Property Manager;</w:t>
+        <w:t xml:space="preserve">Documentazione relativa alle dotazioni di sicurezza obbligatorie per legge (rilevatori di gas ed estintori);</w:t>
       </w:r>
     </w:p>
     <w:p>
@@ -4477,6 +4322,16 @@
       </w:r>
       <w:r>
         <w:t xml:space="preserve">le seguenti clausole: </w:t>
+      </w:r>
+    </w:p>
+    <w:p>
+      <w:pPr>
+        <w:pStyle w:val="Corpotesto"/>
+        <w:spacing w:before="40"/>
+        <w:ind w:left="360"/>
+      </w:pPr>
+      <w:r>
+        <w:t xml:space="preserve">11) Compenso del Property Manager (rimborso forfettario dei costi di avviamento);</w:t>
       </w:r>
     </w:p>
     <w:p>

</xml_diff>

<commit_message>
Revisione completa di coerenza del contratto (recesso/durata minima, terminologia, refusi)
Co-Authored-By: Claude Opus 5.5 <noreply@anthropic.com>
Claude-Session: https://claude.ai/code/session_01WggD5zVqy5TCJTD9M5VXmn
</commit_message>
<xml_diff>
--- a/contratti/Contratto_Mandato_BB_Hospitality_def.docx
+++ b/contratti/Contratto_Mandato_BB_Hospitality_def.docx
@@ -488,7 +488,7 @@
         <w:spacing w:line="362" w:lineRule="auto"/>
       </w:pPr>
       <w:r>
-        <w:t>Il Mandante dichiara e garantisce che l’immobile e gli impianti  sono in regola con le vigenti norme di legge e, anche a tal fine, allega:</w:t>
+        <w:t xml:space="preserve">Il Mandante dichiara e garantisce che l’Immobile e gli impianti sono in regola con le vigenti norme di legge e, anche a tal fine, allega:</w:t>
       </w:r>
     </w:p>
     <w:p>
@@ -833,14 +833,7 @@
         <w:rPr>
           <w:color w:val="000009"/>
         </w:rPr>
-        <w:t>Al fine di adempiere alle obbligazioni di cui all’art.1 che precede, il Property Manager</w:t>
-      </w:r>
-      <w:r>
-        <w:rPr>
-          <w:color w:val="000009"/>
-          <w:spacing w:val="-2"/>
-        </w:rPr>
-        <w:t xml:space="preserve"> provvederà  a fornire servizi rispettivamente al Mandante e agli Ospiti.</w:t>
+        <w:t xml:space="preserve">Al fine di adempiere alle obbligazioni di cui all’art. 1 che precede, il Property Manager provvederà a fornire servizi rispettivamente al Mandante e agli Ospiti.</w:t>
       </w:r>
     </w:p>
     <w:p>
@@ -980,35 +973,7 @@
         <w:rPr>
           <w:color w:val="000009"/>
         </w:rPr>
-        <w:t xml:space="preserve">gestire la pubblicazione e l’aggiornamento periodico di dettagliati annunci per la promozione dell’Immobile, corredati da foto tratte dal </w:t>
-      </w:r>
-      <w:r>
-        <w:rPr>
-          <w:rFonts w:ascii="Arial" w:hAnsi="Arial"/>
-          <w:i/>
-          <w:color w:val="000009"/>
-        </w:rPr>
-        <w:t xml:space="preserve">book </w:t>
-      </w:r>
-      <w:r>
-        <w:rPr>
-          <w:color w:val="000009"/>
-        </w:rPr>
-        <w:t xml:space="preserve">fotografico e della planimetria fornita dal Mandante, su diverse piattaforme </w:t>
-      </w:r>
-      <w:r>
-        <w:rPr>
-          <w:rFonts w:ascii="Arial" w:hAnsi="Arial"/>
-          <w:i/>
-          <w:color w:val="000009"/>
-        </w:rPr>
-        <w:t xml:space="preserve">online </w:t>
-      </w:r>
-      <w:r>
-        <w:rPr>
-          <w:color w:val="000009"/>
-        </w:rPr>
-        <w:t>e/o sul proprio sito internet;</w:t>
+        <w:t xml:space="preserve">gestire la pubblicazione e l’aggiornamento periodico di dettagliati annunci per la promozione dell’Immobile, corredati da foto tratte dal book fotografico e, ove fornita, dalla planimetria del Mandante, su diverse piattaforme online e/o sul proprio sito internet;</w:t>
       </w:r>
     </w:p>
     <w:p>
@@ -1299,17 +1264,7 @@
         <w:jc w:val="both"/>
       </w:pPr>
       <w:r>
-        <w:t xml:space="preserve">Controllare gli incassi prima del </w:t>
-      </w:r>
-      <w:r>
-        <w:rPr>
-          <w:rFonts w:ascii="Arial" w:hAnsi="Arial"/>
-          <w:i/>
-        </w:rPr>
-        <w:t xml:space="preserve">check-in </w:t>
-      </w:r>
-      <w:r>
-        <w:t>attraverso l’accesso al gestionale completo ovvero comunque alla riscossione dei canoni dovuto dagli Ospiti;</w:t>
+        <w:t xml:space="preserve">controllare gli incassi prima del check-in attraverso l’accesso al gestionale completo e, comunque, provvedere alla riscossione dei canoni dovuti dagli Ospiti;</w:t>
       </w:r>
     </w:p>
     <w:p>
@@ -1353,7 +1308,7 @@
         <w:ind w:left="360"/>
       </w:pPr>
       <w:r>
-        <w:t>richiedere agli Ospiti di rilascio di recensioni sulle piattaforme o siti utilizzati dagli stessi per il perfezionamento del rapporto locatizio;</w:t>
+        <w:t xml:space="preserve">richiedere agli Ospiti il rilascio di recensioni sulle piattaforme o sui siti utilizzati per la prenotazione;</w:t>
       </w:r>
     </w:p>
     <w:p>
@@ -1450,22 +1405,7 @@
           <w:color w:val="000009"/>
           <w:spacing w:val="-2"/>
         </w:rPr>
-        <w:t>Nel dettaglio</w:t>
-      </w:r>
-      <w:r>
-        <w:rPr>
-          <w:b/>
-          <w:color w:val="000009"/>
-          <w:spacing w:val="-2"/>
-        </w:rPr>
-        <w:t>, i servizi che il Property Manager si impegna a fornire agli Ospiti</w:t>
-      </w:r>
-      <w:r>
-        <w:rPr>
-          <w:color w:val="000009"/>
-          <w:spacing w:val="-2"/>
-        </w:rPr>
-        <w:t xml:space="preserve"> (cosiddetti “servizi accessori alla locazione” sono:</w:t>
+        <w:t xml:space="preserve">Nel dettaglio, i servizi che il Property Manager si impegna a fornire agli Ospiti (cosiddetti “servizi accessori alla locazione”) sono:</w:t>
       </w:r>
     </w:p>
     <w:p>
@@ -1503,7 +1443,7 @@
         <w:jc w:val="both"/>
       </w:pPr>
       <w:r>
-        <w:t>prendere contatto con gli Ospiti per accordi su orario di arrivo e partenza, inviando messaggi mail di benvenuto con le istruzioni per check-in e check-out</w:t>
+        <w:t xml:space="preserve">prendere contatto con gli Ospiti per accordi su orario di arrivo e partenza, inviando messaggi di benvenuto con le istruzioni per check-in e check-out;</w:t>
       </w:r>
     </w:p>
     <w:p>
@@ -1790,7 +1730,7 @@
         <w:jc w:val="both"/>
       </w:pPr>
       <w:r>
-        <w:t>Per tutta la durata del presente Contratto il Mandante si impegna a rendere disponibile l’Immobile al fine di consentire al Property Manager di adempiere alle proprie obbligazioni e dar corso alle locazioni.</w:t>
+        <w:t xml:space="preserve">Per tutta la durata del presente Contratto il Mandante si impegna a rendere disponibile l’Immobile al fine di consentire al Property Manager di adempiere alle proprie obbligazioni e dar corso alle locazioni, fatto salvo l’uso personale disciplinato dai commi seguenti.</w:t>
       </w:r>
     </w:p>
     <w:p>
@@ -1987,7 +1927,7 @@
         <w:jc w:val="both"/>
       </w:pPr>
       <w:r>
-        <w:t xml:space="preserve">Per le locazioni a breve termine, inoltre, i corrispettivi ricevuti dal Property Manager a titolo di canone di locazione saranno versati, senza maggiorazione di interessi, dal Property Manager al Mandante mensilmente, secondo quanto previsto dagli artt. 10 e 11, al netto delle eventuali ritenute di legge sull’ammontare dei canoni, ove previste dalla normativa. </w:t>
+        <w:t xml:space="preserve">Per le locazioni a breve termine, i corrispettivi ricevuti dal Property Manager a titolo di canone di locazione saranno versati, senza maggiorazione di interessi, dal Property Manager al Mandante mensilmente, secondo quanto previsto dagli artt. 10 e 11, al netto delle eventuali ritenute di legge sull’ammontare dei canoni, ove previste dalla normativa.</w:t>
       </w:r>
       <w:bookmarkStart w:id="8" w:name="Per_le_locazioni_a_breve_termine,_inoltr"/>
       <w:bookmarkEnd w:id="8"/>
@@ -2770,11 +2710,652 @@
         <w:rPr/>
       </w:pPr>
       <w:r>
-        <w:t xml:space="preserve">E’ altresì responsabile </w:t>
-      </w:r>
-      <w:r>
+        <w:t xml:space="preserve">È altresì responsabile della richiesta, della riscossione e della gestione del deposito cauzionale o di idonee garanzie previste per le locazioni di media durata, nonché dello svolgimento delle attività di controllo previste nella fase di check-out. Il Property Manager risponde degli eventuali danni o ammanchi che avrebbe potuto rilevare e contestare all’Ospite mediante l’ordinaria diligenza richiesta nell’esecuzione dell’incarico e che non siano stati rilevati o contestati per sua negligenza, nonché dell’eventuale mancata o inesatta gestione del deposito cauzionale, nei limiti delle somme effettivamente disponibili.</w:t>
+      </w:r>
+      <w:proofErr w:type="spellStart"/>
+      <w:proofErr w:type="spellEnd"/>
+    </w:p>
+    <w:p>
+      <w:pPr>
+        <w:pStyle w:val="Corpotesto"/>
+        <w:spacing w:line="367" w:lineRule="auto"/>
+        <w:jc w:val="both"/>
+      </w:pPr>
+      <w:r>
+        <w:t xml:space="preserve">Il </w:t>
+      </w:r>
+      <w:proofErr w:type="spellStart"/>
+      <w:r>
+        <w:t>Property</w:t>
+      </w:r>
+      <w:proofErr w:type="spellEnd"/>
+      <w:r>
+        <w:t xml:space="preserve"> Manager è responsabile del corretto adempimento degli obblighi di registrazione preliminare dell’Immobile e di comunicazione alle Autorità Competenti dei dati degli Ospiti, dei versamenti da lui dovuti in forza di Contratto a Pubbliche Amministrazioni (ad es: imposta di soggiorno) anche di natura fiscale (ad es.: ritenute di legge ove previste) ed in genere dei pagamenti o prestazioni dovute a terzi in forza di Contratto.</w:t>
+      </w:r>
+    </w:p>
+    <w:p>
+      <w:pPr>
+        <w:pStyle w:val="Corpotesto"/>
+        <w:spacing w:line="364" w:lineRule="auto"/>
+        <w:jc w:val="both"/>
+      </w:pPr>
+      <w:r>
+        <w:t xml:space="preserve">Il Mandante dichiara di manlevare e tenere indenne il Property Manager rispetto a qualsiasi azione, rivendicazione, pretesa o richiesta ad esso rivolta da parte di terzi, di cui il Mandante non gli ha dato notizia, </w:t>
+      </w:r>
+      <w:r>
+        <w:lastRenderedPageBreak/>
+        <w:t>che si dichiarino proprietari o possessori, o che comunque assumano di vantare diritti sull’Immobile per ragioni non imputabili al Property Manager.</w:t>
+      </w:r>
+    </w:p>
+    <w:p>
+      <w:pPr>
+        <w:pStyle w:val="Corpotesto"/>
+        <w:spacing w:line="364" w:lineRule="auto"/>
+        <w:jc w:val="both"/>
+      </w:pPr>
+      <w:r>
+        <w:t xml:space="preserve">Il Property Manager risponde della gestione dei pagamenti provenienti dalle Prenotazioni. </w:t>
+      </w:r>
+    </w:p>
+    <w:p>
+      <w:pPr>
+        <w:pStyle w:val="Corpotesto"/>
+        <w:spacing w:line="367" w:lineRule="auto"/>
+        <w:jc w:val="both"/>
+      </w:pPr>
+      <w:r>
+        <w:t xml:space="preserve">Il </w:t>
+      </w:r>
+      <w:proofErr w:type="spellStart"/>
+      <w:r>
+        <w:t>Property</w:t>
+      </w:r>
+      <w:proofErr w:type="spellEnd"/>
+      <w:r>
+        <w:t xml:space="preserve"> Manager non assume alcun onere di verifica in merito alla veridicità o correttezza del contenuto della documentazione fornitagli dal Mandante al fine dell’individuazione e predisposizione della documentazione contrattuale, tecnica ed amministrativa, restandone esclusivo responsabile il Mandante.</w:t>
+      </w:r>
+    </w:p>
+    <w:p>
+      <w:pPr>
+        <w:pStyle w:val="Corpotesto"/>
+        <w:spacing w:line="367" w:lineRule="auto"/>
+        <w:jc w:val="both"/>
+      </w:pPr>
+    </w:p>
+    <w:p>
+      <w:pPr>
+        <w:pStyle w:val="Corpotesto"/>
+        <w:spacing w:line="367" w:lineRule="auto"/>
+        <w:jc w:val="both"/>
+      </w:pPr>
+      <w:r>
+        <w:t xml:space="preserve">Il Property Manager non è custode dell’immobile ed è espressamente manlevato da ogni responsabilità relativa a: </w:t>
+      </w:r>
+    </w:p>
+    <w:p>
+      <w:pPr>
+        <w:pStyle w:val="Corpotesto"/>
+        <w:numPr>
+          <w:ilvl w:val="0"/>
+          <w:numId w:val="30"/>
+        </w:numPr>
+        <w:spacing w:line="367" w:lineRule="auto"/>
+        <w:jc w:val="both"/>
+      </w:pPr>
+      <w:r>
+        <w:t>Danni arrecati dagli ospiti all’immobile</w:t>
+      </w:r>
+    </w:p>
+    <w:p>
+      <w:pPr>
+        <w:pStyle w:val="Corpotesto"/>
+        <w:numPr>
+          <w:ilvl w:val="0"/>
+          <w:numId w:val="30"/>
+        </w:numPr>
+        <w:spacing w:line="367" w:lineRule="auto"/>
+        <w:jc w:val="both"/>
+      </w:pPr>
+      <w:r>
+        <w:t>Danni subiti dagli ospiti durante il soggiorno</w:t>
+      </w:r>
+    </w:p>
+    <w:p>
+      <w:pPr>
+        <w:pStyle w:val="Corpotesto"/>
+        <w:spacing w:before="120"/>
+        <w:rPr>
+          <w:rFonts w:ascii="Microsoft Sans Serif"/>
+        </w:rPr>
+      </w:pPr>
+    </w:p>
+    <w:p>
+      <w:pPr>
+        <w:pStyle w:val="Titolo21"/>
+        <w:numPr>
+          <w:ilvl w:val="0"/>
+          <w:numId w:val="9"/>
+        </w:numPr>
+        <w:tabs>
+          <w:tab w:val="left" w:pos="845"/>
+        </w:tabs>
+        <w:spacing w:before="1"/>
+        <w:ind w:left="0" w:hanging="421"/>
+      </w:pPr>
+      <w:r>
+        <w:t>Manutenzione dell’Immobile</w:t>
+      </w:r>
+    </w:p>
+    <w:p>
+      <w:pPr>
+        <w:pStyle w:val="Corpotesto"/>
+        <w:spacing w:before="130" w:line="360" w:lineRule="auto"/>
+        <w:jc w:val="both"/>
+      </w:pPr>
+      <w:r>
+        <w:t xml:space="preserve">Tutti i costi di manutenzione dell’Immobile, dei relativi impianti, arredi e dotazioni, </w:t>
+      </w:r>
+      <w:r>
+        <w:rPr>
+          <w:b/>
+        </w:rPr>
+        <w:t>sia ordinaria sia straordinaria, sono a esclusivo carico del Mandante</w:t>
+      </w:r>
+      <w:r>
+        <w:t>. Il Property Manager non sostiene, né è tenuto ad anticipare, alcun costo di manutenzione, salvo d</w:t>
+      </w:r>
+      <w:r>
+        <w:t>iverso accordo scritto tra le Parti.</w:t>
+      </w:r>
+    </w:p>
+    <w:p>
+      <w:pPr>
+        <w:pStyle w:val="Corpotesto"/>
+        <w:spacing w:before="120" w:line="360" w:lineRule="auto"/>
+        <w:jc w:val="both"/>
+      </w:pPr>
+      <w:r>
+        <w:t>Ogni intervento di manutenzione deve essere preventivamente concordato con il Mandante. A tal fine il Property Manager, rilevata direttamente o su segnalazione degli Ospiti la necessità di un intervento, ne dà comunicaz</w:t>
+      </w:r>
+      <w:r>
+        <w:t xml:space="preserve">ione al Mandante e gli trasmette un </w:t>
+      </w:r>
+      <w:r>
+        <w:rPr>
+          <w:b/>
+        </w:rPr>
+        <w:t>preventivo di spesa intestato a BB Hospitality S.r.l.</w:t>
+      </w:r>
+    </w:p>
+    <w:p>
+      <w:pPr>
+        <w:pStyle w:val="Corpotesto"/>
+        <w:spacing w:before="120" w:line="360" w:lineRule="auto"/>
+        <w:jc w:val="both"/>
+      </w:pPr>
+      <w:r>
+        <w:t xml:space="preserve">Il Mandante comunica per iscritto (anche a mezzo e-mail o messaggistica istantanea) l’approvazione o il rifiuto del preventivo. Solo dopo l’approvazione, l’intervento viene eseguito dai manutentori incaricati dal Property Manager, che ne fattura il relativo importo al Mandante secondo quanto indicato nel preventivo approvato. Tale importo potrà essere trattenuto dalle somme da versare al Mandante ai sensi dell’art. 10.</w:t>
+      </w:r>
+    </w:p>
+    <w:p>
+      <w:pPr>
+        <w:pStyle w:val="Corpotesto"/>
+        <w:spacing w:before="120" w:line="360" w:lineRule="auto"/>
+        <w:jc w:val="both"/>
+      </w:pPr>
+      <w:r>
+        <w:t xml:space="preserve">Qualora il Mandante non approvi il preventivo, potrà far eseguire l’intervento, a propria </w:t>
+      </w:r>
+      <w:r>
+        <w:t>cura e spese, da fornitori di propria fiducia, coordinandosi con il Property Manager per l’accesso all’Immobile compatibilmente con le prenotazioni in corso; in tal caso il Property Manager non risponde dell’esecuzione dell’intervento. Restano in ogni caso</w:t>
+      </w:r>
+      <w:r>
+        <w:t xml:space="preserve"> a carico del Mandante le conseguenze della mancata o ritardata esecuzione degli interventi necessari (a titolo esemplificativo: rimborsi o indennizzi riconosciuti agli Ospiti, cancellazioni, blocco del calendario).</w:t>
+      </w:r>
+    </w:p>
+    <w:p>
+      <w:pPr>
+        <w:pStyle w:val="Corpotesto"/>
+        <w:spacing w:before="120" w:line="360" w:lineRule="auto"/>
+        <w:jc w:val="both"/>
+      </w:pPr>
+      <w:r>
+        <w:t>Nei soli casi di urgenza, ossia quando i</w:t>
+      </w:r>
+      <w:r>
+        <w:t xml:space="preserve">l ritardo potrebbe causare pericolo per persone o cose, danni all’Immobile o compromettere l’utilizzo dell’Immobile da parte degli Ospiti presenti (a titolo esemplificativo: perdite d’acqua, guasti agli impianti elettrico, idraulico o di riscaldamento), e </w:t>
+      </w:r>
+      <w:r>
+        <w:t>il Mandante non sia raggiungibile in tempo utile, il Property Manager è autorizzato a disporre gli interventi strettamente necessari fino a un importo massimo di euro 200,00 (duecento/00) per singolo intervento, dandone tempestiva comunicazione al Mandante</w:t>
+      </w:r>
+      <w:r>
+        <w:t>. Anche tali costi restano a carico del Mandante.</w:t>
+      </w:r>
+    </w:p>
+    <w:p>
+      <w:pPr>
+        <w:pStyle w:val="Corpotesto"/>
+        <w:spacing w:before="120"/>
+        <w:rPr>
+          <w:rFonts w:ascii="Microsoft Sans Serif"/>
+        </w:rPr>
+      </w:pPr>
+    </w:p>
+    <w:p>
+      <w:pPr>
+        <w:pStyle w:val="Titolo21"/>
+        <w:numPr>
+          <w:ilvl w:val="0"/>
+          <w:numId w:val="9"/>
+        </w:numPr>
+        <w:tabs>
+          <w:tab w:val="left" w:pos="845"/>
+        </w:tabs>
+        <w:spacing w:before="1"/>
+        <w:ind w:left="0" w:hanging="421"/>
+      </w:pPr>
+      <w:r>
+        <w:t>Interventi in loco e accesso degli Ospiti</w:t>
+      </w:r>
+    </w:p>
+    <w:p>
+      <w:pPr>
+        <w:pStyle w:val="Corpotesto"/>
+        <w:spacing w:before="130" w:line="360" w:lineRule="auto"/>
+        <w:jc w:val="both"/>
+      </w:pPr>
+      <w:r>
+        <w:t xml:space="preserve">Per “Intervento in Loco” si intende l’uscita presso l’Immobile del Property Manager o di personale da esso incaricato, al di fuori delle attività programmate (check-in, pulizie, check-out). In caso di problemi di accesso degli Ospiti all’Immobile, il Property Manager garantisce l’esecuzione dell’Intervento in Loco nel più breve tempo possibile, compatibilmente con i tempi tecnici necessari a raggiungere l’Immobile.</w:t>
+      </w:r>
+    </w:p>
+    <w:p>
+      <w:pPr>
+        <w:pStyle w:val="Corpotesto"/>
+        <w:spacing w:before="120" w:line="360" w:lineRule="auto"/>
+        <w:jc w:val="both"/>
+      </w:pPr>
+      <w:r>
+        <w:t xml:space="preserve">Il Property Manager garantisce, senza costi aggiuntivi per il Mandante, 1 (un) Intervento in Loco al mese per il normale controllo dello stato dell’Immobile. Ogni ulteriore Intervento in Loco, ivi compresi quelli relativi all’allestimento e all’arredamento iniziale dell’Immobile, alla presenza durante lavori di ristrutturazione o manutenzione o a qualsiasi altro intervento legato all’Immobile, ha un costo di euro 50,00 (cinquanta/00) oltre IVA per uscita, oltre agli eventuali costi vivi strettamente necessari (a titolo esemplificativo: intervento del fabbro per l’apertura della porta, duplicazione delle chiavi), salvo quanto previsto dai commi seguenti per gli Interventi in Loco resi necessari da problemi di accesso degli Ospiti. La riparazione o sostituzione di serrature, cilindri o dispositivi di accesso è regolata dall’art. 13, salvo che si renda necessaria per fatto del Property Manager o del personale da esso incaricato, nel qual caso è a carico del Property Manager.</w:t>
+      </w:r>
+    </w:p>
+    <w:p>
+      <w:pPr>
+        <w:pStyle w:val="Corpotesto"/>
+        <w:spacing w:before="120" w:line="360" w:lineRule="auto"/>
+        <w:jc w:val="both"/>
+      </w:pPr>
+      <w:r>
+        <w:rPr>
+          <w:b/>
+        </w:rPr>
+        <w:t>Sono interamente (100%) a carico del Property Manager</w:t>
+      </w:r>
+      <w:r>
+        <w:t xml:space="preserve"> i costi degli Interventi in Loco derivanti da comportamento negligente del Property Manager o del personale da esso incaricato, ivi compresi gli addetti alle pulizie, quali, a titolo esemplif</w:t>
+      </w:r>
+      <w:r>
+        <w:t>icativo:</w:t>
+      </w:r>
+    </w:p>
+    <w:p>
+      <w:pPr>
+        <w:pStyle w:val="Paragrafoelenco"/>
+        <w:numPr>
+          <w:ilvl w:val="0"/>
+          <w:numId w:val="31"/>
+        </w:numPr>
+        <w:spacing w:before="60" w:line="360" w:lineRule="auto"/>
+        <w:ind w:left="357" w:hanging="357"/>
+        <w:jc w:val="both"/>
+      </w:pPr>
+      <w:r>
+        <w:t>la mancata messa a disposizione delle chiavi o dei dispositivi di accesso per l’Ospite (ad esempio chiavi non lasciate nella cassetta di sicurezza o nel luogo concordato);</w:t>
+      </w:r>
+    </w:p>
+    <w:p>
+      <w:pPr>
+        <w:pStyle w:val="Paragrafoelenco"/>
+        <w:numPr>
+          <w:ilvl w:val="0"/>
+          <w:numId w:val="31"/>
+        </w:numPr>
+        <w:spacing w:before="60" w:line="360" w:lineRule="auto"/>
+        <w:ind w:left="357" w:hanging="357"/>
+        <w:jc w:val="both"/>
+      </w:pPr>
+      <w:r>
+        <w:t>la comunicazione all’Ospite di istruzioni o codici di accesso errati o inco</w:t>
+      </w:r>
+      <w:r>
+        <w:t>mpleti.</w:t>
+      </w:r>
+    </w:p>
+    <w:p>
+      <w:pPr>
+        <w:pStyle w:val="Corpotesto"/>
+        <w:spacing w:before="120" w:line="360" w:lineRule="auto"/>
+        <w:jc w:val="both"/>
+      </w:pPr>
+      <w:r>
+        <w:rPr>
+          <w:b/>
+        </w:rPr>
+        <w:t>Sono ripartiti al 50% a carico del Property Manager e al 50% a carico del Mandante</w:t>
+      </w:r>
+      <w:r>
+        <w:t xml:space="preserve"> i costi degli Interventi in Loco derivanti dal comportamento dell’Ospite o, comunque, dall’impossibilità per l’Ospite di accedere all’Immobile per qualsiasi ragione </w:t>
+      </w:r>
+      <w:r>
+        <w:t>non imputabile al Property Manager, e in particolare:</w:t>
+      </w:r>
+    </w:p>
+    <w:p>
+      <w:pPr>
+        <w:pStyle w:val="Paragrafoelenco"/>
+        <w:numPr>
+          <w:ilvl w:val="0"/>
+          <w:numId w:val="32"/>
+        </w:numPr>
+        <w:spacing w:before="60" w:line="360" w:lineRule="auto"/>
+        <w:ind w:left="357" w:hanging="357"/>
+        <w:jc w:val="both"/>
+      </w:pPr>
+      <w:r>
+        <w:t>lo smarrimento, il furto o il danneggiamento delle chiavi o dei dispositivi di accesso da parte dell’Ospite, con necessità di consegnargliene una copia o di riaprire l’Immobile;</w:t>
+      </w:r>
+    </w:p>
+    <w:p>
+      <w:pPr>
+        <w:pStyle w:val="Paragrafoelenco"/>
+        <w:numPr>
+          <w:ilvl w:val="0"/>
+          <w:numId w:val="32"/>
+        </w:numPr>
+        <w:spacing w:before="60" w:line="360" w:lineRule="auto"/>
+        <w:ind w:left="357" w:hanging="357"/>
+        <w:jc w:val="both"/>
+      </w:pPr>
+      <w:r>
+        <w:t>l’impossibilità per l’Ospite di accedere all’Immobile per qualsiasi ragione non imputabile al Property Manager (ad esempio chiavi dimenticate all’interno dell’Immobile, porta chiusa accidentalmente, errato utilizzo della cassetta di sicurezza o della serra</w:t>
+      </w:r>
+      <w:r>
+        <w:t>tura, codici di accesso dimenticati, malfunzionamento dei dispositivi di accesso).</w:t>
+      </w:r>
+    </w:p>
+    <w:p>
+      <w:pPr>
+        <w:pStyle w:val="Corpotesto"/>
+        <w:spacing w:before="120" w:line="360" w:lineRule="auto"/>
+        <w:jc w:val="both"/>
+      </w:pPr>
+      <w:r>
+        <w:t>Sono invece interamente a carico del Mandante i costi degli Interventi in Loco derivanti da fatto del Mandante o di soggetti da lui incaricati (ad esempio chiavi non riconse</w:t>
+      </w:r>
+      <w:r>
+        <w:t>gnate dopo l’utilizzo dell’Immobile nelle Date Escluse).</w:t>
+      </w:r>
+    </w:p>
+    <w:p>
+      <w:pPr>
+        <w:pStyle w:val="Corpotesto"/>
+        <w:spacing w:before="120" w:line="360" w:lineRule="auto"/>
+        <w:jc w:val="both"/>
+      </w:pPr>
+      <w:r>
+        <w:t>Resta salvo il diritto di rivalsa nei confronti dell’Ospite responsabile, anche mediante trattenuta sul deposito cauzionale o tramite le procedure di rimborso previste dalle piattaforme di prenotazio</w:t>
+      </w:r>
+      <w:r>
+        <w:t>ne; le somme eventualmente recuperate sono ripartite tra le Parti nella stessa proporzione in cui ne hanno sostenuto il costo.</w:t>
+      </w:r>
+    </w:p>
+    <w:p>
+      <w:pPr>
+        <w:pStyle w:val="Corpotesto"/>
+        <w:spacing w:before="120" w:line="360" w:lineRule="auto"/>
+        <w:jc w:val="both"/>
+      </w:pPr>
+      <w:r>
+        <w:t xml:space="preserve">Gli importi a carico del Mandante ai sensi del presente articolo sono indicati nel rendiconto mensile di cui all’art. 4 e possono essere trattenuti dalle somme da versare al Mandante ai sensi dell’art. 10.</w:t>
+      </w:r>
+    </w:p>
+    <w:p>
+      <w:pPr>
+        <w:pStyle w:val="Corpotesto"/>
+        <w:spacing w:before="111"/>
+        <w:rPr>
+          <w:rFonts w:ascii="Microsoft Sans Serif"/>
+        </w:rPr>
+      </w:pPr>
+    </w:p>
+    <w:p>
+      <w:pPr>
+        <w:pStyle w:val="Titolo21"/>
+        <w:numPr>
+          <w:ilvl w:val="0"/>
+          <w:numId w:val="9"/>
+        </w:numPr>
+        <w:tabs>
+          <w:tab w:val="left" w:pos="847"/>
+        </w:tabs>
+        <w:ind w:left="0" w:hanging="423"/>
+      </w:pPr>
+      <w:r>
+        <w:rPr>
+          <w:spacing w:val="-2"/>
+        </w:rPr>
+        <w:t>Assicurazione</w:t>
+      </w:r>
+    </w:p>
+    <w:p>
+      <w:pPr>
+        <w:pStyle w:val="Corpotesto"/>
+        <w:spacing w:before="132" w:line="360" w:lineRule="auto"/>
+        <w:jc w:val="both"/>
+      </w:pPr>
+      <w:r>
+        <w:t xml:space="preserve">Il Property Manager si impegna a stipulare una polizza assicurativa a copertura dei rischi connessi alla propria attività e a trasmetterne copia al Mandante con successiva comunicazione a mezzo e-mail.</w:t>
+      </w:r>
+    </w:p>
+    <w:p>
+      <w:pPr>
+        <w:pStyle w:val="Corpotesto"/>
+        <w:spacing w:before="2" w:line="360" w:lineRule="auto"/>
+        <w:jc w:val="both"/>
+      </w:pPr>
+      <w:r>
+        <w:t xml:space="preserve">Il Mandante dichiara di avere stipulato adeguata polizza assicurativa, con primaria compagnia, a copertura dei rischi di incendio (fabbricato e contenuto), furto, responsabilità civile verso i conduttori e verso terzi, che viene allegata al presente contratto (allegato d).</w:t>
+      </w:r>
+    </w:p>
+    <w:p>
+      <w:pPr>
+        <w:pStyle w:val="Corpotesto"/>
+        <w:spacing w:before="120"/>
+        <w:rPr>
+          <w:rFonts w:ascii="Microsoft Sans Serif"/>
+        </w:rPr>
+      </w:pPr>
+    </w:p>
+    <w:p>
+      <w:pPr>
+        <w:pStyle w:val="Titolo21"/>
+        <w:numPr>
+          <w:ilvl w:val="0"/>
+          <w:numId w:val="9"/>
+        </w:numPr>
+        <w:tabs>
+          <w:tab w:val="left" w:pos="845"/>
+        </w:tabs>
+        <w:spacing w:before="1"/>
+        <w:ind w:left="0" w:hanging="421"/>
+      </w:pPr>
+      <w:r>
+        <w:t xml:space="preserve">Durata e </w:t>
+      </w:r>
+      <w:r>
+        <w:rPr>
+          <w:spacing w:val="-2"/>
+        </w:rPr>
+        <w:t>recesso</w:t>
+      </w:r>
+    </w:p>
+    <w:p>
+      <w:pPr>
+        <w:pStyle w:val="Corpotesto"/>
+        <w:spacing w:before="134" w:line="360" w:lineRule="auto"/>
+        <w:jc w:val="both"/>
+      </w:pPr>
+      <w:r>
+        <w:t xml:space="preserve">Il presente Contratto ha </w:t>
+      </w:r>
+      <w:r>
+        <w:rPr>
+          <w:b/>
+        </w:rPr>
+        <w:t>durata di 1 (un) anno</w:t>
+      </w:r>
+      <w:r>
+        <w:t xml:space="preserve"> a decorrere dalla data di sottoscrizione e si rinnova tacitamente di anno in anno, salvo recesso di una delle Parti ai sensi dei commi seguenti.</w:t>
+      </w:r>
+    </w:p>
+    <w:p>
+      <w:pPr>
+        <w:pStyle w:val="Corpotesto"/>
+        <w:spacing w:before="120" w:line="360" w:lineRule="auto"/>
+        <w:jc w:val="both"/>
         <w:rPr/>
-        <w:t xml:space="preserve">della richiesta, della riscossione e della gestione del deposito cauzionale o di idonee garanzie previste per le locazioni di media durata, nonché dello svolgimento delle attività di controllo previste nella fase di check-out. Il </w:t>
+      </w:pPr>
+      <w:r>
+        <w:rPr/>
+        <w:t xml:space="preserve">Fermo quanto previsto dal successivo comma in merito alla durata minima, ciascuna Parte potrà recedere dal Contratto mediante comunicazione scritta da inviarsi all’altra Parte a mezzo raccomandata A/R o PEC, con un preavviso di 2 (due) mesi. Il recesso avrà effetto a decorrere dall’ultimo giorno del secondo mese solare successivo a quello in cui la relativa comunicazione sarà pervenuta all’altra Parte.</w:t>
+      </w:r>
+    </w:p>
+    <w:p>
+      <w:pPr>
+        <w:pStyle w:val="Corpotesto"/>
+        <w:spacing w:before="120" w:line="360" w:lineRule="auto"/>
+        <w:jc w:val="both"/>
+      </w:pPr>
+      <w:r>
+        <w:t>A titolo esemplificativo, in caso di comunicazione ricevuta il 15 ottobre, il Contratto cesserà il 31 dicembre successivo.</w:t>
+      </w:r>
+      <w:r>
+        <w:t xml:space="preserve"> </w:t>
+      </w:r>
+    </w:p>
+    <w:p>
+      <w:pPr>
+        <w:pStyle w:val="Corpotesto"/>
+        <w:spacing w:before="120" w:line="360" w:lineRule="auto"/>
+        <w:jc w:val="both"/>
+      </w:pPr>
+      <w:r>
+        <w:t xml:space="preserve">Le Parti convengono una durata minima del Contratto di 6 (sei) mesi dalla data di sottoscrizione. Pertanto il recesso non può essere comunicato prima che siano decorsi 4 (quattro) mesi dalla sottoscrizione; l’eventuale comunicazione pervenuta prima di tale termine si intenderà ricevuta il giorno successivo alla sua scadenza. In ogni caso il Contratto non potrà cessare per recesso prima che siano decorsi 6 (sei) mesi dalla sua sottoscrizione. Qualora il Contratto cessi per recesso del Mandante, o per risoluzione dovuta a inadempimento del Mandante, prima che sia decorso 1 (un) anno dalla sottoscrizione, il Mandante corrisponderà al Property Manager il rimborso forfettario dei costi di avviamento pari a euro 500,00 (cinquecento/00) oltre IVA, di cui all’art. 11.</w:t>
+      </w:r>
+    </w:p>
+    <w:p>
+      <w:pPr>
+        <w:pStyle w:val="Corpotesto"/>
+        <w:spacing w:before="120" w:line="360" w:lineRule="auto"/>
+        <w:jc w:val="both"/>
+        <w:rPr/>
+      </w:pPr>
+      <w:r>
+        <w:rPr/>
+        <w:t xml:space="preserve">Il rimborso forfettario di cui al comma precedente non è dovuto qualora il Contratto cessi per recesso del Property Manager o per risoluzione dovuta a inadempimento del Property Manager. Può essere trattenuto dalle somme da versare al Mandante ai sensi dell’art. 10.</w:t>
+      </w:r>
+      <w:proofErr w:type="spellStart"/>
+      <w:proofErr w:type="spellEnd"/>
+    </w:p>
+    <w:p>
+      <w:pPr>
+        <w:pStyle w:val="Corpotesto"/>
+        <w:spacing w:before="120" w:line="360" w:lineRule="auto"/>
+        <w:jc w:val="both"/>
+      </w:pPr>
+      <w:r>
+        <w:t xml:space="preserve">Le prenotazioni in essere alla data di cessazione del Contratto, per qualsiasi causa intervenuta, sono regolate dal successivo art. 17. Restano fermi gli obblighi di rendicontazione e di versamento delle somme maturate fino alla data di cessazione.</w:t>
+      </w:r>
+    </w:p>
+    <w:p>
+      <w:pPr>
+        <w:pStyle w:val="Corpotesto"/>
+        <w:spacing w:before="120"/>
+        <w:rPr>
+          <w:rFonts w:ascii="Microsoft Sans Serif"/>
+        </w:rPr>
+      </w:pPr>
+    </w:p>
+    <w:p>
+      <w:pPr>
+        <w:pStyle w:val="Titolo21"/>
+        <w:numPr>
+          <w:ilvl w:val="0"/>
+          <w:numId w:val="9"/>
+        </w:numPr>
+        <w:tabs>
+          <w:tab w:val="left" w:pos="845"/>
+        </w:tabs>
+        <w:spacing w:before="1"/>
+        <w:ind w:left="0" w:hanging="421"/>
+      </w:pPr>
+      <w:r>
+        <w:t>Prenotazioni in essere alla cessazione del Contratto</w:t>
+      </w:r>
+    </w:p>
+    <w:p>
+      <w:pPr>
+        <w:pStyle w:val="Corpotesto"/>
+        <w:spacing w:before="130" w:line="360" w:lineRule="auto"/>
+        <w:jc w:val="both"/>
+      </w:pPr>
+      <w:r>
+        <w:t xml:space="preserve">Si considerano “Prenotazioni Future” tutte le prenotazioni acquisite nel corso del rapporto per effetto dell’attività del Property Manager, confermate e in essere alla data di cessazione del Contratto, aventi ad oggetto pernottamenti successivi a tale data. Nell’esempio di cui all’art. 16, sono Prenotazioni Future quelle in essere al 31 dicembre per i pernottamenti dal 1° gennaio successivo in poi. In caso di soggiorno a cavallo della data di cessazione, si considerano i soli pernottamenti successivi a tale data.</w:t>
+      </w:r>
+      <w:proofErr w:type="spellStart"/>
+      <w:proofErr w:type="spellEnd"/>
+    </w:p>
+    <w:p>
+      <w:pPr>
+        <w:pStyle w:val="Corpotesto"/>
+        <w:spacing w:before="120" w:line="360" w:lineRule="auto"/>
+        <w:jc w:val="both"/>
+      </w:pPr>
+      <w:r>
+        <w:t xml:space="preserve">A fronte dell’attività di promozione e acquisizione svolta, per le Prenotazioni Future il Mandante riconosce al Property Manager un compenso forfettario (il “Compenso di Fine Mandato”) pari al 30% (trenta per cento) del Costo del Pernottamento, come definito all’art. 11, relativo ai pernottamenti successivi alla data di cessazione.</w:t>
+      </w:r>
+    </w:p>
+    <w:p>
+      <w:pPr>
+        <w:pStyle w:val="Corpotesto"/>
+        <w:spacing w:before="120" w:line="360" w:lineRule="auto"/>
+        <w:jc w:val="both"/>
+        <w:rPr/>
+      </w:pPr>
+      <w:r>
+        <w:t xml:space="preserve">Il Compenso di Fine Mandato </w:t>
+      </w:r>
+      <w:r>
+        <w:t/>
+      </w:r>
+      <w:r>
+        <w:rPr/>
+        <w:t xml:space="preserve">è dovuto con riferimento a tutte le Prenotazioni Future risultanti in essere alla data di cessazione del Contratto, indipendentemente dalla data di effettuazione del relativo soggiorno e dalle modalità con cui il relativo importo sarà successivamente corrisposto dal canale di prenotazione o dall’Ospite.</w:t>
+      </w:r>
+      <w:r>
+        <w:rPr/>
+        <w:t xml:space="preserve"> Esso sarà liquidato entro tale data.</w:t>
+      </w:r>
+    </w:p>
+    <w:p>
+      <w:pPr>
+        <w:pStyle w:val="Corpotesto"/>
+        <w:spacing w:before="120" w:line="360" w:lineRule="auto"/>
+        <w:jc w:val="both"/>
+        <w:rPr/>
+      </w:pPr>
+      <w:r>
+        <w:rPr/>
+        <w:t xml:space="preserve">Entro la data di cessazione del Contratto, il </w:t>
       </w:r>
       <w:proofErr w:type="spellStart"/>
       <w:r>
@@ -2784,59 +3365,86 @@
       <w:proofErr w:type="spellEnd"/>
       <w:r>
         <w:rPr/>
-        <w:t xml:space="preserve"> Manager risponde degli eventuali danni o ammanchi che avrebbe potuto rilevare e contestare all’Ospite mediante l’ordinaria diligenza richiesta nell’esecuzione dell’incarico e che non siano stati rilevati o contestati per sua negligenza, nonché dell’eventuale mancata o inesatta gestione del deposito cauzionale, nei limiti delle somme effettivamente disponibili.</w:t>
-      </w:r>
-    </w:p>
-    <w:p>
-      <w:pPr>
-        <w:pStyle w:val="Corpotesto"/>
-        <w:spacing w:line="367" w:lineRule="auto"/>
-        <w:jc w:val="both"/>
-      </w:pPr>
-      <w:r>
+        <w:t xml:space="preserve"> Manager trasmetterà al Mandante un prospetto riepilogativo delle Prenotazioni Future, con indicazione delle relative date, degli importi e del Compenso di Fine Mandato dovuto, ed emetterà la relativa fattura. Le eventuali Prenotazioni Future acquisite o confermate successivamente alla trasmissione del prospetto e comunque entro la data di cessazione del Contratto saranno oggetto di successivo conguaglio, da effettuarsi entro 10 (dieci) giorni dalla data di cessazione.</w:t>
+      </w:r>
+    </w:p>
+    <w:p>
+      <w:pPr>
+        <w:pStyle w:val="Corpotesto"/>
+        <w:spacing w:before="120" w:line="360" w:lineRule="auto"/>
+        <w:jc w:val="both"/>
+        <w:rPr/>
+      </w:pPr>
+      <w:r>
+        <w:rPr/>
+        <w:t xml:space="preserve">Il Compenso di Fine Mandato è determinato in via forfettaria anche in considerazione del rischio di successive cancellazioni, modifiche, riduzioni del soggiorno o mancata presentazione dell’Ospite. Pertanto, una volta maturato il diritto al Compenso di Fine Mandato, eventuali cancellazioni, modifiche, riduzioni o mancati soggiorni relativi alle Prenotazioni Future non comporteranno alcun obbligo del </w:t>
+      </w:r>
+      <w:proofErr w:type="spellStart"/>
+      <w:r>
+        <w:rPr/>
+        <w:t>Property</w:t>
+      </w:r>
+      <w:proofErr w:type="spellEnd"/>
+      <w:r>
+        <w:rPr/>
+        <w:t xml:space="preserve"> Manager di restituzione, totale o parziale, del compenso già maturato.</w:t>
+      </w:r>
+    </w:p>
+    <w:p>
+      <w:pPr>
+        <w:pStyle w:val="Corpotesto"/>
+        <w:spacing w:before="120" w:line="360" w:lineRule="auto"/>
+        <w:jc w:val="both"/>
+      </w:pPr>
+      <w:r>
+        <w:t>Dalla data di cessazione, la gestione delle Prenotazioni Future (accoglienza, puliz</w:t>
+      </w:r>
+      <w:r>
+        <w:t xml:space="preserve">ie, assistenza agli Ospiti e relativi adempimenti amministrativi e fiscali) passa al Mandante, direttamente o tramite terzi da lui incaricati, </w:t>
+      </w:r>
+      <w:r>
+        <w:lastRenderedPageBreak/>
+        <w:t xml:space="preserve">che ne assume ogni onere e responsabilità nei confronti degli </w:t>
+      </w:r>
+      <w:r>
+        <w:t>Ospiti</w:t>
+      </w:r>
+      <w:r>
+        <w:t>.</w:t>
+      </w:r>
+      <w:r>
+        <w:rPr/>
+        <w:t xml:space="preserve"> </w:t>
+      </w:r>
+      <w:r>
+        <w:rPr/>
         <w:t xml:space="preserve">Il </w:t>
       </w:r>
       <w:proofErr w:type="spellStart"/>
       <w:r>
+        <w:rPr/>
         <w:t>Property</w:t>
       </w:r>
       <w:proofErr w:type="spellEnd"/>
       <w:r>
-        <w:t xml:space="preserve"> Manager è responsabile del corretto adempimento degli obblighi di registrazione preliminare dell’Immobile e di comunicazione alle Autorità Competenti dei dati degli Ospiti, dei versamenti da lui dovuti in forza di Contratto a Pubbliche Amministrazioni (ad es: imposta di soggiorno) anche di natura fiscale (ad es.: ritenute di legge ove previste) ed in genere dei pagamenti o prestazioni dovute a terzi in forza di Contratto.</w:t>
-      </w:r>
-    </w:p>
-    <w:p>
-      <w:pPr>
-        <w:pStyle w:val="Corpotesto"/>
-        <w:spacing w:line="364" w:lineRule="auto"/>
-        <w:jc w:val="both"/>
-      </w:pPr>
-      <w:r>
-        <w:t xml:space="preserve">Il Mandante dichiara di manlevare e tenere indenne il Property Manager rispetto a qualsiasi azione, rivendicazione, pretesa o richiesta ad esso rivolta da parte di terzi, di cui il Mandante non gli ha dato notizia, </w:t>
-      </w:r>
-      <w:r>
-        <w:lastRenderedPageBreak/>
-        <w:t>che si dichiarino proprietari o possessori, o che comunque assumano di vantare diritti sull’Immobile per ragioni non imputabili al Property Manager.</w:t>
-      </w:r>
-    </w:p>
-    <w:p>
-      <w:pPr>
-        <w:pStyle w:val="Corpotesto"/>
-        <w:spacing w:line="364" w:lineRule="auto"/>
-        <w:jc w:val="both"/>
-      </w:pPr>
-      <w:r>
-        <w:t xml:space="preserve">Il Property Manager risponde della gestione dei pagamenti provenienti dalle Prenotazioni. </w:t>
-      </w:r>
-    </w:p>
-    <w:p>
-      <w:pPr>
-        <w:pStyle w:val="Corpotesto"/>
-        <w:spacing w:line="367" w:lineRule="auto"/>
-        <w:jc w:val="both"/>
-      </w:pPr>
-      <w:r>
-        <w:t xml:space="preserve">Il </w:t>
+        <w:rPr/>
+        <w:t xml:space="preserve"> Manager non sarà pertanto responsabile degli obblighi e degli adempimenti relativi alla gestione dei soggiorni successivi alla cessazione del Contratto</w:t>
+      </w:r>
+      <w:r>
+        <w:t>. Il Property Manager consegna al Mandante, e</w:t>
+      </w:r>
+      <w:r>
+        <w:t>ntro la data di cessazione, l’elenco e i dettagli delle Prenotazioni Future e presta la collaborazione ragionevolmente necessaria al passaggio di consegne.</w:t>
+      </w:r>
+    </w:p>
+    <w:p>
+      <w:pPr>
+        <w:pStyle w:val="Corpotesto"/>
+        <w:spacing w:before="120" w:line="360" w:lineRule="auto"/>
+        <w:jc w:val="both"/>
+      </w:pPr>
+      <w:r>
+        <w:t xml:space="preserve">Le somme relative alle Prenotazioni Future eventualmente incassate dal </w:t>
       </w:r>
       <w:proofErr w:type="spellStart"/>
       <w:r>
@@ -2844,58 +3452,78 @@
       </w:r>
       <w:proofErr w:type="spellEnd"/>
       <w:r>
-        <w:t xml:space="preserve"> Manager non assume alcun onere di verifica in merito alla veridicità o correttezza del contenuto della documentazione fornitagli dal Mandante al fine dell’individuazione e predisposizione della documentazione contrattuale, tecnica ed amministrativa, restandone esclusivo responsabile il Mandante.</w:t>
-      </w:r>
-    </w:p>
-    <w:p>
-      <w:pPr>
-        <w:pStyle w:val="Corpotesto"/>
-        <w:spacing w:line="367" w:lineRule="auto"/>
-        <w:jc w:val="both"/>
-      </w:pPr>
-    </w:p>
-    <w:p>
-      <w:pPr>
-        <w:pStyle w:val="Corpotesto"/>
-        <w:spacing w:line="367" w:lineRule="auto"/>
-        <w:jc w:val="both"/>
-      </w:pPr>
-      <w:r>
-        <w:t xml:space="preserve">Il Property Manager non è custode dell’immobile ed è espressamente manlevato da ogni responsabilità relativa a: </w:t>
-      </w:r>
-    </w:p>
-    <w:p>
-      <w:pPr>
-        <w:pStyle w:val="Corpotesto"/>
-        <w:numPr>
-          <w:ilvl w:val="0"/>
-          <w:numId w:val="30"/>
-        </w:numPr>
-        <w:spacing w:line="367" w:lineRule="auto"/>
-        <w:jc w:val="both"/>
-      </w:pPr>
-      <w:r>
-        <w:t>Danni arrecati dagli ospiti all’immobile</w:t>
-      </w:r>
-    </w:p>
-    <w:p>
-      <w:pPr>
-        <w:pStyle w:val="Corpotesto"/>
-        <w:numPr>
-          <w:ilvl w:val="0"/>
-          <w:numId w:val="30"/>
-        </w:numPr>
-        <w:spacing w:line="367" w:lineRule="auto"/>
-        <w:jc w:val="both"/>
-      </w:pPr>
-      <w:r>
-        <w:t>Danni subiti dagli ospiti durante il soggiorno</w:t>
-      </w:r>
-    </w:p>
-    <w:p>
-      <w:pPr>
-        <w:pStyle w:val="Corpotesto"/>
-        <w:spacing w:before="120"/>
+        <w:t xml:space="preserve"> Manager, anche </w:t>
+      </w:r>
+      <w:r>
+        <w:rPr/>
+        <w:t>successivamente</w:t>
+      </w:r>
+      <w:r>
+        <w:t xml:space="preserve"> </w:t>
+      </w:r>
+      <w:r>
+        <w:t xml:space="preserve">alla cessazione </w:t>
+      </w:r>
+      <w:r>
+        <w:rPr/>
+        <w:t>del Contratto</w:t>
+      </w:r>
+      <w:r>
+        <w:t xml:space="preserve"> </w:t>
+      </w:r>
+      <w:r>
+        <w:t xml:space="preserve">(ad esempio accrediti delle piattaforme di prenotazione successivi al check-in), </w:t>
+      </w:r>
+      <w:r>
+        <w:t>sono</w:t>
+      </w:r>
+      <w:r>
+        <w:t xml:space="preserve"> </w:t>
+      </w:r>
+      <w:r>
+        <w:t>riversate al Mandant</w:t>
+      </w:r>
+      <w:r>
+        <w:t xml:space="preserve">e entro 30 (trenta) giorni dal </w:t>
+      </w:r>
+      <w:r>
+        <w:rPr/>
+        <w:t>relativo</w:t>
+      </w:r>
+      <w:r>
+        <w:t xml:space="preserve"> </w:t>
+      </w:r>
+      <w:r>
+        <w:t>incasso, al netto delle commissioni trattenute dalle piattaforme</w:t>
+      </w:r>
+      <w:r>
+        <w:t xml:space="preserve"> </w:t>
+      </w:r>
+      <w:r>
+        <w:rPr/>
+        <w:t>di prenotazione</w:t>
+      </w:r>
+      <w:r>
+        <w:t xml:space="preserve"> e del Compenso di Fine Mandato eventual</w:t>
+      </w:r>
+      <w:r>
+        <w:t>mente non ancora corrisposto.</w:t>
+      </w:r>
+    </w:p>
+    <w:p>
+      <w:pPr>
+        <w:pStyle w:val="Corpotesto"/>
+        <w:spacing w:before="120" w:line="360" w:lineRule="auto"/>
+        <w:jc w:val="both"/>
+      </w:pPr>
+      <w:r>
+        <w:t xml:space="preserve">Il Compenso di Fine Mandato non è dovuto in caso di risoluzione del Contratto per inadempimento del Property Manager ai sensi dell’art. 18.</w:t>
+      </w:r>
+    </w:p>
+    <w:p>
+      <w:pPr>
+        <w:pStyle w:val="Corpotesto"/>
+        <w:spacing w:before="129"/>
         <w:rPr>
           <w:rFonts w:ascii="Microsoft Sans Serif"/>
         </w:rPr>
@@ -2911,162 +3539,57 @@
         <w:tabs>
           <w:tab w:val="left" w:pos="845"/>
         </w:tabs>
-        <w:spacing w:before="1"/>
         <w:ind w:left="0" w:hanging="421"/>
       </w:pPr>
       <w:r>
-        <w:t>Manutenzione dell’Immobile</w:t>
-      </w:r>
-    </w:p>
-    <w:p>
-      <w:pPr>
-        <w:pStyle w:val="Corpotesto"/>
-        <w:spacing w:before="130" w:line="360" w:lineRule="auto"/>
-        <w:jc w:val="both"/>
-      </w:pPr>
-      <w:r>
-        <w:t xml:space="preserve">Tutti i costi di manutenzione dell’Immobile, dei relativi impianti, arredi e dotazioni, </w:t>
-      </w:r>
-      <w:r>
-        <w:rPr>
-          <w:b/>
-        </w:rPr>
-        <w:t>sia ordinaria sia straordinaria, sono a esclusivo carico del Mandante</w:t>
-      </w:r>
-      <w:r>
-        <w:t>. Il Property Manager non sostiene, né è tenuto ad anticipare, alcun costo di manutenzione, salvo d</w:t>
-      </w:r>
-      <w:r>
-        <w:t>iverso accordo scritto tra le Parti.</w:t>
-      </w:r>
-    </w:p>
-    <w:p>
-      <w:pPr>
-        <w:pStyle w:val="Corpotesto"/>
-        <w:spacing w:before="120" w:line="360" w:lineRule="auto"/>
-        <w:jc w:val="both"/>
-      </w:pPr>
-      <w:r>
-        <w:t>Ogni intervento di manutenzione deve essere preventivamente concordato con il Mandante. A tal fine il Property Manager, rilevata direttamente o su segnalazione degli Ospiti la necessità di un intervento, ne dà comunicaz</w:t>
-      </w:r>
-      <w:r>
-        <w:t xml:space="preserve">ione al Mandante e gli trasmette un </w:t>
-      </w:r>
-      <w:r>
-        <w:rPr>
-          <w:b/>
-        </w:rPr>
-        <w:t>preventivo di spesa intestato a BB Hospitality S.r.l.</w:t>
-      </w:r>
-    </w:p>
-    <w:p>
-      <w:pPr>
-        <w:pStyle w:val="Corpotesto"/>
-        <w:spacing w:before="120" w:line="360" w:lineRule="auto"/>
-        <w:jc w:val="both"/>
-      </w:pPr>
-      <w:r>
-        <w:t xml:space="preserve">Il Mandante comunica per iscritto (anche a mezzo e-mail o messaggistica istantanea) l’approvazione o il rifiuto del preventivo. Solo dopo l’approvazione, l’intervento viene eseguito dai manutentori incaricati dal Property Manager, che ne fattura il relativo importo al Mandante secondo quanto indicato nel preventivo approvato. Tale importo potrà essere trattenuto dalle somme da versare al Mandante ai sensi dell’art. 10.</w:t>
-      </w:r>
-    </w:p>
-    <w:p>
-      <w:pPr>
-        <w:pStyle w:val="Corpotesto"/>
-        <w:spacing w:before="120" w:line="360" w:lineRule="auto"/>
-        <w:jc w:val="both"/>
-      </w:pPr>
-      <w:r>
-        <w:t xml:space="preserve">Qualora il Mandante non approvi il preventivo, potrà far eseguire l’intervento, a propria </w:t>
-      </w:r>
-      <w:r>
-        <w:t>cura e spese, da fornitori di propria fiducia, coordinandosi con il Property Manager per l’accesso all’Immobile compatibilmente con le prenotazioni in corso; in tal caso il Property Manager non risponde dell’esecuzione dell’intervento. Restano in ogni caso</w:t>
-      </w:r>
-      <w:r>
-        <w:t xml:space="preserve"> a carico del Mandante le conseguenze della mancata o ritardata esecuzione degli interventi necessari (a titolo esemplificativo: rimborsi o indennizzi riconosciuti agli Ospiti, cancellazioni, blocco del calendario).</w:t>
-      </w:r>
-    </w:p>
-    <w:p>
-      <w:pPr>
-        <w:pStyle w:val="Corpotesto"/>
-        <w:spacing w:before="120" w:line="360" w:lineRule="auto"/>
-        <w:jc w:val="both"/>
-      </w:pPr>
-      <w:r>
-        <w:t>Nei soli casi di urgenza, ossia quando i</w:t>
-      </w:r>
-      <w:r>
-        <w:t xml:space="preserve">l ritardo potrebbe causare pericolo per persone o cose, danni all’Immobile o compromettere l’utilizzo dell’Immobile da parte degli Ospiti presenti (a titolo esemplificativo: perdite d’acqua, guasti agli impianti elettrico, idraulico o di riscaldamento), e </w:t>
-      </w:r>
-      <w:r>
-        <w:t>il Mandante non sia raggiungibile in tempo utile, il Property Manager è autorizzato a disporre gli interventi strettamente necessari fino a un importo massimo di euro 200,00 (duecento/00) per singolo intervento, dandone tempestiva comunicazione al Mandante</w:t>
-      </w:r>
-      <w:r>
-        <w:t>. Anche tali costi restano a carico del Mandante.</w:t>
-      </w:r>
-    </w:p>
-    <w:p>
-      <w:pPr>
-        <w:pStyle w:val="Corpotesto"/>
-        <w:spacing w:before="120"/>
-        <w:rPr>
-          <w:rFonts w:ascii="Microsoft Sans Serif"/>
-        </w:rPr>
-      </w:pPr>
-    </w:p>
-    <w:p>
-      <w:pPr>
-        <w:pStyle w:val="Titolo21"/>
+        <w:t xml:space="preserve">Clausola risolutiva </w:t>
+      </w:r>
+      <w:r>
+        <w:rPr>
+          <w:spacing w:val="-2"/>
+        </w:rPr>
+        <w:t>espressa</w:t>
+      </w:r>
+    </w:p>
+    <w:p>
+      <w:pPr>
+        <w:pStyle w:val="Corpotesto"/>
+        <w:spacing w:before="135" w:line="360" w:lineRule="auto"/>
+        <w:jc w:val="both"/>
+        <w:rPr/>
+      </w:pPr>
+      <w:r>
+        <w:rPr/>
+        <w:t>Ai sensi e per gli effetti dell’art. 1456 del Codice Civile, ciascuna Parte potrà dichiarare risolto di diritto il presente Contratto mediante comunicazione scritta all’altra Parte, qualora quest’ultima si renda inadempiente rispetto a una delle obbligazioni di seguito specificamente individuate, purché l’inadempimento sia imputabile alla Parte inadempiente e, ove previsto, non sia stato sanato entro il termine indicato nella relativa messa in mora.</w:t>
+      </w:r>
+    </w:p>
+    <w:p>
+      <w:pPr>
+        <w:tabs>
+          <w:tab w:val="left" w:pos="1319"/>
+        </w:tabs>
+        <w:spacing w:line="256" w:lineRule="exact"/>
+        <w:jc w:val="both"/>
+      </w:pPr>
+      <w:r>
+        <w:t>Quanto alle obbligazioni in capo al Mandante:</w:t>
+      </w:r>
+    </w:p>
+    <w:p>
+      <w:pPr>
+        <w:pStyle w:val="Paragrafoelenco"/>
         <w:numPr>
           <w:ilvl w:val="0"/>
-          <w:numId w:val="9"/>
-        </w:numPr>
-        <w:tabs>
-          <w:tab w:val="left" w:pos="845"/>
-        </w:tabs>
-        <w:spacing w:before="1"/>
-        <w:ind w:left="0" w:hanging="421"/>
-      </w:pPr>
-      <w:r>
-        <w:t>Interventi in loco e accesso degli Ospiti</w:t>
-      </w:r>
-    </w:p>
-    <w:p>
-      <w:pPr>
-        <w:pStyle w:val="Corpotesto"/>
-        <w:spacing w:before="130" w:line="360" w:lineRule="auto"/>
-        <w:jc w:val="both"/>
-      </w:pPr>
-      <w:r>
-        <w:t xml:space="preserve">Per “Intervento in Loco” si intende l’uscita presso l’Immobile del Property Manager o di personale da esso incaricato, al di fuori delle attività programmate (check-in, pulizie, check-out). In caso di problemi di accesso degli Ospiti all’Immobile, il Property Manager garantisce l’esecuzione dell’Intervento in Loco nel più breve tempo possibile, compatibilmente con i tempi tecnici necessari a raggiungere l’Immobile.</w:t>
-      </w:r>
-    </w:p>
-    <w:p>
-      <w:pPr>
-        <w:pStyle w:val="Corpotesto"/>
-        <w:spacing w:before="120" w:line="360" w:lineRule="auto"/>
-        <w:jc w:val="both"/>
-      </w:pPr>
-      <w:r>
-        <w:t xml:space="preserve">Il Property Manager garantisce, senza costi aggiuntivi per il Mandante, 1 (un) Intervento in Loco al mese per il normale controllo dello stato dell’Immobile. Ogni ulteriore Intervento in Loco, ivi compresi quelli relativi all’allestimento e all’arredamento iniziale dell’Immobile, alla presenza durante lavori di ristrutturazione o manutenzione o a qualsiasi altro intervento legato all’Immobile, ha un costo di euro 50,00 (cinquanta/00) oltre IVA per uscita, oltre agli eventuali costi vivi strettamente necessari (a titolo esemplificativo: intervento del fabbro per l’apertura della porta, duplicazione delle chiavi), salvo quanto previsto dai commi seguenti per gli Interventi in Loco resi necessari da problemi di accesso degli Ospiti. La riparazione o sostituzione di serrature, cilindri o dispositivi di accesso è regolata dall’art. 13, salvo che si renda necessaria per fatto del Property Manager o del personale da esso incaricato, nel qual caso è a carico del Property Manager.</w:t>
-      </w:r>
-    </w:p>
-    <w:p>
-      <w:pPr>
-        <w:pStyle w:val="Corpotesto"/>
-        <w:spacing w:before="120" w:line="360" w:lineRule="auto"/>
-        <w:jc w:val="both"/>
-      </w:pPr>
-      <w:r>
-        <w:rPr>
-          <w:b/>
-        </w:rPr>
-        <w:t>Sono interamente (100%) a carico del Property Manager</w:t>
-      </w:r>
-      <w:r>
-        <w:t xml:space="preserve"> i costi degli Interventi in Loco derivanti da comportamento negligente del Property Manager o del personale da esso incaricato, ivi compresi gli addetti alle pulizie, quali, a titolo esemplif</w:t>
-      </w:r>
-      <w:r>
-        <w:t>icativo:</w:t>
+          <w:numId w:val="23"/>
+        </w:numPr>
+        <w:tabs>
+          <w:tab w:val="left" w:pos="1320"/>
+        </w:tabs>
+        <w:spacing w:before="122" w:line="360" w:lineRule="auto"/>
+        <w:jc w:val="both"/>
+      </w:pPr>
+      <w:r>
+        <w:t>il mancato pagamento delle somme spettanti al Property Manager dovute a titolo di compenso o rimborso spese, decorso il termine di 30 gg dalla ricezione della lettera di messa in mora;</w:t>
       </w:r>
     </w:p>
     <w:p>
@@ -3074,14 +3597,30 @@
         <w:pStyle w:val="Paragrafoelenco"/>
         <w:numPr>
           <w:ilvl w:val="0"/>
-          <w:numId w:val="31"/>
-        </w:numPr>
-        <w:spacing w:before="60" w:line="360" w:lineRule="auto"/>
-        <w:ind w:left="357" w:hanging="357"/>
-        <w:jc w:val="both"/>
-      </w:pPr>
-      <w:r>
-        <w:t>la mancata messa a disposizione delle chiavi o dei dispositivi di accesso per l’Ospite (ad esempio chiavi non lasciate nella cassetta di sicurezza o nel luogo concordato);</w:t>
+          <w:numId w:val="23"/>
+        </w:numPr>
+        <w:tabs>
+          <w:tab w:val="left" w:pos="1320"/>
+        </w:tabs>
+        <w:spacing w:before="10" w:line="355" w:lineRule="auto"/>
+        <w:jc w:val="both"/>
+      </w:pPr>
+      <w:r>
+        <w:t xml:space="preserve">la mancata consegna dell’Immobile </w:t>
+      </w:r>
+      <w:r>
+        <w:t xml:space="preserve">al </w:t>
+      </w:r>
+      <w:proofErr w:type="spellStart"/>
+      <w:r>
+        <w:t>Property</w:t>
+      </w:r>
+      <w:proofErr w:type="spellEnd"/>
+      <w:r>
+        <w:t xml:space="preserve"> Manager </w:t>
+      </w:r>
+      <w:r>
+        <w:t>entro 10 giorni dalla ricezione della lettera di messa in mora;</w:t>
       </w:r>
     </w:p>
     <w:p>
@@ -3089,345 +3628,14 @@
         <w:pStyle w:val="Paragrafoelenco"/>
         <w:numPr>
           <w:ilvl w:val="0"/>
-          <w:numId w:val="31"/>
-        </w:numPr>
-        <w:spacing w:before="60" w:line="360" w:lineRule="auto"/>
-        <w:ind w:left="357" w:hanging="357"/>
-        <w:jc w:val="both"/>
-      </w:pPr>
-      <w:r>
-        <w:t>la comunicazione all’Ospite di istruzioni o codici di accesso errati o inco</w:t>
-      </w:r>
-      <w:r>
-        <w:t>mpleti.</w:t>
-      </w:r>
-    </w:p>
-    <w:p>
-      <w:pPr>
-        <w:pStyle w:val="Corpotesto"/>
-        <w:spacing w:before="120" w:line="360" w:lineRule="auto"/>
-        <w:jc w:val="both"/>
-      </w:pPr>
-      <w:r>
-        <w:rPr>
-          <w:b/>
-        </w:rPr>
-        <w:t>Sono ripartiti al 50% a carico del Property Manager e al 50% a carico del Mandante</w:t>
-      </w:r>
-      <w:r>
-        <w:t xml:space="preserve"> i costi degli Interventi in Loco derivanti dal comportamento dell’Ospite o, comunque, dall’impossibilità per l’Ospite di accedere all’Immobile per qualsiasi ragione </w:t>
-      </w:r>
-      <w:r>
-        <w:t>non imputabile al Property Manager, e in particolare:</w:t>
-      </w:r>
-    </w:p>
-    <w:p>
-      <w:pPr>
-        <w:pStyle w:val="Paragrafoelenco"/>
-        <w:numPr>
-          <w:ilvl w:val="0"/>
-          <w:numId w:val="32"/>
-        </w:numPr>
-        <w:spacing w:before="60" w:line="360" w:lineRule="auto"/>
-        <w:ind w:left="357" w:hanging="357"/>
-        <w:jc w:val="both"/>
-      </w:pPr>
-      <w:r>
-        <w:t>lo smarrimento, il furto o il danneggiamento delle chiavi o dei dispositivi di accesso da parte dell’Ospite, con necessità di consegnargliene una copia o di riaprire l’Immobile;</w:t>
-      </w:r>
-    </w:p>
-    <w:p>
-      <w:pPr>
-        <w:pStyle w:val="Paragrafoelenco"/>
-        <w:numPr>
-          <w:ilvl w:val="0"/>
-          <w:numId w:val="32"/>
-        </w:numPr>
-        <w:spacing w:before="60" w:line="360" w:lineRule="auto"/>
-        <w:ind w:left="357" w:hanging="357"/>
-        <w:jc w:val="both"/>
-      </w:pPr>
-      <w:r>
-        <w:t>l’impossibilità per l’Ospite di accedere all’Immobile per qualsiasi ragione non imputabile al Property Manager (ad esempio chiavi dimenticate all’interno dell’Immobile, porta chiusa accidentalmente, errato utilizzo della cassetta di sicurezza o della serra</w:t>
-      </w:r>
-      <w:r>
-        <w:t>tura, codici di accesso dimenticati, malfunzionamento dei dispositivi di accesso).</w:t>
-      </w:r>
-    </w:p>
-    <w:p>
-      <w:pPr>
-        <w:pStyle w:val="Corpotesto"/>
-        <w:spacing w:before="120" w:line="360" w:lineRule="auto"/>
-        <w:jc w:val="both"/>
-      </w:pPr>
-      <w:r>
-        <w:t>Sono invece interamente a carico del Mandante i costi degli Interventi in Loco derivanti da fatto del Mandante o di soggetti da lui incaricati (ad esempio chiavi non riconse</w:t>
-      </w:r>
-      <w:r>
-        <w:t>gnate dopo l’utilizzo dell’Immobile nelle Date Escluse).</w:t>
-      </w:r>
-    </w:p>
-    <w:p>
-      <w:pPr>
-        <w:pStyle w:val="Corpotesto"/>
-        <w:spacing w:before="120" w:line="360" w:lineRule="auto"/>
-        <w:jc w:val="both"/>
-      </w:pPr>
-      <w:r>
-        <w:t>Resta salvo il diritto di rivalsa nei confronti dell’Ospite responsabile, anche mediante trattenuta sul deposito cauzionale o tramite le procedure di rimborso previste dalle piattaforme di prenotazio</w:t>
-      </w:r>
-      <w:r>
-        <w:t>ne; le somme eventualmente recuperate sono ripartite tra le Parti nella stessa proporzione in cui ne hanno sostenuto il costo.</w:t>
-      </w:r>
-    </w:p>
-    <w:p>
-      <w:pPr>
-        <w:pStyle w:val="Corpotesto"/>
-        <w:spacing w:before="120" w:line="360" w:lineRule="auto"/>
-        <w:jc w:val="both"/>
-      </w:pPr>
-      <w:r>
-        <w:t xml:space="preserve">Gli importi a carico del Mandante ai sensi del presente articolo sono indicati nel rendiconto mensile di cui all’art. 4 e possono essere trattenuti dalle somme da versare al Mandante ai sensi dell’art. 10.</w:t>
-      </w:r>
-    </w:p>
-    <w:p>
-      <w:pPr>
-        <w:pStyle w:val="Corpotesto"/>
-        <w:spacing w:before="111"/>
-        <w:rPr>
-          <w:rFonts w:ascii="Microsoft Sans Serif"/>
-        </w:rPr>
-      </w:pPr>
-    </w:p>
-    <w:p>
-      <w:pPr>
-        <w:pStyle w:val="Titolo21"/>
-        <w:numPr>
-          <w:ilvl w:val="0"/>
-          <w:numId w:val="9"/>
-        </w:numPr>
-        <w:tabs>
-          <w:tab w:val="left" w:pos="847"/>
-        </w:tabs>
-        <w:ind w:left="0" w:hanging="423"/>
-      </w:pPr>
-      <w:r>
-        <w:rPr>
-          <w:spacing w:val="-2"/>
-        </w:rPr>
-        <w:t>Assicurazione</w:t>
-      </w:r>
-    </w:p>
-    <w:p>
-      <w:pPr>
-        <w:pStyle w:val="Corpotesto"/>
-        <w:spacing w:before="132" w:line="360" w:lineRule="auto"/>
-        <w:jc w:val="both"/>
-      </w:pPr>
-      <w:r>
-        <w:t xml:space="preserve">Il Property Manager si impegna a stipulare una polizza assicurativa a copertura dei rischi connessi alla propria attività e a trasmetterne copia al Mandante con successiva comunicazione a mezzo e-mail.</w:t>
-      </w:r>
-    </w:p>
-    <w:p>
-      <w:pPr>
-        <w:pStyle w:val="Corpotesto"/>
-        <w:spacing w:before="2" w:line="360" w:lineRule="auto"/>
-        <w:jc w:val="both"/>
-      </w:pPr>
-      <w:r>
-        <w:t xml:space="preserve">Il Mandante dichiara di avere stipulato adeguata polizza assicurativa, con primaria compagnia, a copertura dei rischi di incendio (fabbricato e contenuto), furto, responsabilità civile verso i conduttori e verso terzi, che viene allegata al presente contratto (allegato d).</w:t>
-      </w:r>
-    </w:p>
-    <w:p>
-      <w:pPr>
-        <w:pStyle w:val="Corpotesto"/>
-        <w:spacing w:before="120"/>
-        <w:rPr>
-          <w:rFonts w:ascii="Microsoft Sans Serif"/>
-        </w:rPr>
-      </w:pPr>
-    </w:p>
-    <w:p>
-      <w:pPr>
-        <w:pStyle w:val="Titolo21"/>
-        <w:numPr>
-          <w:ilvl w:val="0"/>
-          <w:numId w:val="9"/>
-        </w:numPr>
-        <w:tabs>
-          <w:tab w:val="left" w:pos="845"/>
-        </w:tabs>
-        <w:spacing w:before="1"/>
-        <w:ind w:left="0" w:hanging="421"/>
-      </w:pPr>
-      <w:r>
-        <w:t xml:space="preserve">Durata e </w:t>
-      </w:r>
-      <w:r>
-        <w:rPr>
-          <w:spacing w:val="-2"/>
-        </w:rPr>
-        <w:t>recesso</w:t>
-      </w:r>
-    </w:p>
-    <w:p>
-      <w:pPr>
-        <w:pStyle w:val="Corpotesto"/>
-        <w:spacing w:before="134" w:line="360" w:lineRule="auto"/>
-        <w:jc w:val="both"/>
-      </w:pPr>
-      <w:r>
-        <w:t xml:space="preserve">Il presente Contratto ha </w:t>
-      </w:r>
-      <w:r>
-        <w:rPr>
-          <w:b/>
-        </w:rPr>
-        <w:t>durata di 1 (un) anno</w:t>
-      </w:r>
-      <w:r>
-        <w:t xml:space="preserve"> a decorrere dalla data di sottoscrizione e si rinnova tacitamente di anno in anno, salvo recesso di una delle Parti ai sensi dei commi seguenti.</w:t>
-      </w:r>
-    </w:p>
-    <w:p>
-      <w:pPr>
-        <w:pStyle w:val="Corpotesto"/>
-        <w:spacing w:before="120" w:line="360" w:lineRule="auto"/>
-        <w:jc w:val="both"/>
+          <w:numId w:val="23"/>
+        </w:numPr>
+        <w:spacing w:line="360" w:lineRule="auto"/>
         <w:rPr/>
       </w:pPr>
       <w:r>
         <w:rPr/>
-        <w:t>Ciascuna Parte potrà recedere dal Contratto in qualsiasi momento, mediante comunicazione scritta da inviarsi all’altra Parte a mezzo raccomandata A/R o PEC, con un preavviso di 2 (due) mesi. Il recesso avrà effetto a decorrere dall’ultimo giorno del secondo mese solare successivo a quello in cui la relativa comunicazione sarà pervenuta all’altra Parte.</w:t>
-      </w:r>
-    </w:p>
-    <w:p>
-      <w:pPr>
-        <w:pStyle w:val="Corpotesto"/>
-        <w:spacing w:before="120" w:line="360" w:lineRule="auto"/>
-        <w:jc w:val="both"/>
-      </w:pPr>
-      <w:r>
-        <w:t>A titolo esemplificativo, in caso di comunicazione ricevuta il 15 ottobre, il Contratto cesserà il 31 dicembre successivo.</w:t>
-      </w:r>
-      <w:r>
-        <w:t xml:space="preserve"> </w:t>
-      </w:r>
-    </w:p>
-    <w:p>
-      <w:pPr>
-        <w:pStyle w:val="Corpotesto"/>
-        <w:spacing w:before="120" w:line="360" w:lineRule="auto"/>
-        <w:jc w:val="both"/>
-      </w:pPr>
-      <w:r>
-        <w:t xml:space="preserve">Le Parti convengono una durata minima del Contratto di 6 (sei) mesi dalla data di sottoscrizione. Pertanto il recesso non può essere comunicato prima che siano decorsi 4 (quattro) mesi dalla sottoscrizione; l’eventuale comunicazione pervenuta prima di tale termine si intenderà ricevuta il giorno successivo alla sua scadenza. In ogni caso il Contratto non potrà cessare per recesso prima che siano decorsi 6 (sei) mesi dalla sua sottoscrizione. Qualora il Contratto cessi per recesso del Mandante, o per risoluzione dovuta a inadempimento del Mandante, prima che sia decorso 1 (un) anno dalla sottoscrizione, il Mandante corrisponderà al Property Manager il rimborso forfettario dei costi di avviamento pari a euro 500,00 (cinquecento/00) oltre IVA, di cui all’art. 11.</w:t>
-      </w:r>
-    </w:p>
-    <w:p>
-      <w:pPr>
-        <w:pStyle w:val="Corpotesto"/>
-        <w:spacing w:before="120" w:line="360" w:lineRule="auto"/>
-        <w:jc w:val="both"/>
-        <w:rPr/>
-      </w:pPr>
-      <w:r>
-        <w:rPr/>
-        <w:t xml:space="preserve">Il rimborso forfettario di cui al comma precedente non è dovuto qualora il Contratto cessi per recesso del Property Manager o per risoluzione dovuta a inadempimento del Property Manager. Può essere trattenuto dalle somme da versare al Mandante ai sensi dell’art. 10.</w:t>
-      </w:r>
-      <w:proofErr w:type="spellStart"/>
-      <w:proofErr w:type="spellEnd"/>
-    </w:p>
-    <w:p>
-      <w:pPr>
-        <w:pStyle w:val="Corpotesto"/>
-        <w:spacing w:before="120" w:line="360" w:lineRule="auto"/>
-        <w:jc w:val="both"/>
-      </w:pPr>
-      <w:r>
-        <w:t xml:space="preserve">Le prenotazioni in essere alla data di cessazione del Contratto, per qualsiasi causa intervenuta, sono regolate dal successivo art. 17. Restano fermi gli obblighi di rendicontazione e di versamento delle somme maturate fino alla data di cessazione.</w:t>
-      </w:r>
-    </w:p>
-    <w:p>
-      <w:pPr>
-        <w:pStyle w:val="Corpotesto"/>
-        <w:spacing w:before="120"/>
-        <w:rPr>
-          <w:rFonts w:ascii="Microsoft Sans Serif"/>
-        </w:rPr>
-      </w:pPr>
-    </w:p>
-    <w:p>
-      <w:pPr>
-        <w:pStyle w:val="Titolo21"/>
-        <w:numPr>
-          <w:ilvl w:val="0"/>
-          <w:numId w:val="9"/>
-        </w:numPr>
-        <w:tabs>
-          <w:tab w:val="left" w:pos="845"/>
-        </w:tabs>
-        <w:spacing w:before="1"/>
-        <w:ind w:left="0" w:hanging="421"/>
-      </w:pPr>
-      <w:r>
-        <w:t>Prenotazioni in essere alla cessazione del Contratto</w:t>
-      </w:r>
-    </w:p>
-    <w:p>
-      <w:pPr>
-        <w:pStyle w:val="Corpotesto"/>
-        <w:spacing w:before="130" w:line="360" w:lineRule="auto"/>
-        <w:jc w:val="both"/>
-      </w:pPr>
-      <w:r>
-        <w:t xml:space="preserve">Si considerano “Prenotazioni Future” tutte le prenotazioni acquisite nel corso del rapporto per effetto dell’attività del Property Manager, confermate e in essere alla data di cessazione del Contratto, aventi ad oggetto pernottamenti successivi a tale data. Nell’esempio di cui all’art. 16, sono Prenotazioni Future quelle in essere al 31 dicembre per i pernottamenti dal 1° gennaio successivo in poi. In caso di soggiorno a cavallo della data di cessazione, si considerano i soli pernottamenti successivi a tale data.</w:t>
-      </w:r>
-      <w:proofErr w:type="spellStart"/>
-      <w:proofErr w:type="spellEnd"/>
-    </w:p>
-    <w:p>
-      <w:pPr>
-        <w:pStyle w:val="Corpotesto"/>
-        <w:spacing w:before="120" w:line="360" w:lineRule="auto"/>
-        <w:jc w:val="both"/>
-      </w:pPr>
-      <w:r>
-        <w:t xml:space="preserve">A fronte dell’attività di promozione e acquisizione svolta, per le Prenotazioni Future il Mandante riconosce al Property Manager un compenso forfettario (il “Compenso di Fine Mandato”) pari al 30% (trenta per cento) del Costo del Pernottamento, come definito all’art. 11, relativo ai pernottamenti successivi alla data di cessazione.</w:t>
-      </w:r>
-    </w:p>
-    <w:p>
-      <w:pPr>
-        <w:pStyle w:val="Corpotesto"/>
-        <w:spacing w:before="120" w:line="360" w:lineRule="auto"/>
-        <w:jc w:val="both"/>
-        <w:rPr/>
-      </w:pPr>
-      <w:r>
-        <w:t xml:space="preserve">Il Compenso di Fine Mandato </w:t>
-      </w:r>
-      <w:r>
-        <w:t/>
-      </w:r>
-      <w:r>
-        <w:rPr/>
-        <w:t xml:space="preserve">è dovuto con riferimento a tutte le Prenotazioni Future risultanti in essere alla data di cessazione del Contratto, indipendentemente dalla data di effettuazione del relativo soggiorno e dalle modalità con cui il relativo importo sarà successivamente corrisposto dal canale di prenotazione o dall’Ospite.</w:t>
-      </w:r>
-      <w:r>
-        <w:rPr/>
-        <w:t xml:space="preserve"> Esso sarà liquidato entro tale data.</w:t>
-      </w:r>
-    </w:p>
-    <w:p>
-      <w:pPr>
-        <w:pStyle w:val="Corpotesto"/>
-        <w:spacing w:before="120" w:line="360" w:lineRule="auto"/>
-        <w:jc w:val="both"/>
-        <w:rPr/>
-      </w:pPr>
-      <w:r>
-        <w:rPr/>
-        <w:t xml:space="preserve">Entro la data di cessazione del Contratto, il </w:t>
+        <w:t xml:space="preserve">la mancata comunicazione al </w:t>
       </w:r>
       <w:proofErr w:type="spellStart"/>
       <w:r>
@@ -3437,300 +3645,48 @@
       <w:proofErr w:type="spellEnd"/>
       <w:r>
         <w:rPr/>
-        <w:t xml:space="preserve"> Manager trasmetterà al Mandante un prospetto riepilogativo delle Prenotazioni Future, con indicazione delle relative date, degli importi e del Compenso di Fine Mandato dovuto, ed emetterà la relativa fattura. Le eventuali Prenotazioni Future acquisite o confermate successivamente alla trasmissione del prospetto e comunque entro la data di cessazione del Contratto saranno oggetto di successivo conguaglio, da effettuarsi entro 10 (dieci) giorni dalla data di cessazione.</w:t>
-      </w:r>
-    </w:p>
-    <w:p>
-      <w:pPr>
-        <w:pStyle w:val="Corpotesto"/>
-        <w:spacing w:before="120" w:line="360" w:lineRule="auto"/>
-        <w:jc w:val="both"/>
+        <w:t xml:space="preserve"> Manager di circostanze, informazioni o limitazioni giuridiche o materiali relative all’Immobile che siano rilevanti ai fini della corretta esecuzione dell’incarico, qualora tale omissione impedisca o renda significativamente più gravosa la gestione dell’Immobile.</w:t>
+      </w:r>
+    </w:p>
+    <w:p>
+      <w:pPr>
+        <w:tabs>
+          <w:tab w:val="left" w:pos="1320"/>
+        </w:tabs>
+      </w:pPr>
+      <w:r>
+        <w:t>Q</w:t>
+      </w:r>
+      <w:r>
+        <w:t>uanto alle obbligazioni in capo al Property Manager:</w:t>
+      </w:r>
+    </w:p>
+    <w:p>
+      <w:pPr>
+        <w:pStyle w:val="Paragrafoelenco"/>
+        <w:numPr>
+          <w:ilvl w:val="0"/>
+          <w:numId w:val="25"/>
+        </w:numPr>
+        <w:tabs>
+          <w:tab w:val="left" w:pos="1320"/>
+        </w:tabs>
+        <w:spacing w:before="125" w:line="355" w:lineRule="auto"/>
+        <w:jc w:val="both"/>
+      </w:pPr>
+      <w:r>
+        <w:t xml:space="preserve">il mancato adempimento degli obblighi amministrativi e fiscali </w:t>
+      </w:r>
+      <w:r>
         <w:rPr/>
-      </w:pPr>
-      <w:r>
-        <w:rPr/>
-        <w:t xml:space="preserve">Il Compenso di Fine Mandato è determinato in via forfettaria anche in considerazione del rischio di successive cancellazioni, modifiche, riduzioni del soggiorno o mancata presentazione dell’Ospite. Pertanto, una volta maturato il diritto al Compenso di Fine Mandato, eventuali cancellazioni, modifiche, riduzioni o mancati soggiorni relativi alle Prenotazioni Future non comporteranno alcun obbligo del </w:t>
-      </w:r>
-      <w:proofErr w:type="spellStart"/>
-      <w:r>
-        <w:rPr/>
-        <w:t>Property</w:t>
-      </w:r>
-      <w:proofErr w:type="spellEnd"/>
-      <w:r>
-        <w:rPr/>
-        <w:t xml:space="preserve"> Manager di restituzione, totale o parziale, del compenso già maturato.</w:t>
-      </w:r>
-    </w:p>
-    <w:p>
-      <w:pPr>
-        <w:pStyle w:val="Corpotesto"/>
-        <w:spacing w:before="120" w:line="360" w:lineRule="auto"/>
-        <w:jc w:val="both"/>
-      </w:pPr>
-      <w:r>
-        <w:t>Dalla data di cessazione, la gestione delle Prenotazioni Future (accoglienza, puliz</w:t>
-      </w:r>
-      <w:r>
-        <w:t xml:space="preserve">ie, assistenza agli Ospiti e relativi adempimenti amministrativi e fiscali) passa al Mandante, direttamente o tramite terzi da lui incaricati, </w:t>
-      </w:r>
-      <w:r>
-        <w:lastRenderedPageBreak/>
-        <w:t xml:space="preserve">che ne assume ogni onere e responsabilità nei confronti degli </w:t>
-      </w:r>
-      <w:r>
-        <w:t>Ospiti</w:t>
-      </w:r>
-      <w:r>
-        <w:t>.</w:t>
+        <w:t>espressamente</w:t>
       </w:r>
       <w:r>
         <w:rPr/>
         <w:t xml:space="preserve"> </w:t>
       </w:r>
       <w:r>
-        <w:rPr/>
-        <w:t xml:space="preserve">Il </w:t>
-      </w:r>
-      <w:proofErr w:type="spellStart"/>
-      <w:r>
-        <w:rPr/>
-        <w:t>Property</w:t>
-      </w:r>
-      <w:proofErr w:type="spellEnd"/>
-      <w:r>
-        <w:rPr/>
-        <w:t xml:space="preserve"> Manager non sarà pertanto responsabile degli obblighi e degli adempimenti relativi alla gestione dei soggiorni successivi alla cessazione del Contratto</w:t>
-      </w:r>
-      <w:r>
-        <w:t>. Il Property Manager consegna al Mandante, e</w:t>
-      </w:r>
-      <w:r>
-        <w:t>ntro la data di cessazione, l’elenco e i dettagli delle Prenotazioni Future e presta la collaborazione ragionevolmente necessaria al passaggio di consegne.</w:t>
-      </w:r>
-    </w:p>
-    <w:p>
-      <w:pPr>
-        <w:pStyle w:val="Corpotesto"/>
-        <w:spacing w:before="120" w:line="360" w:lineRule="auto"/>
-        <w:jc w:val="both"/>
-      </w:pPr>
-      <w:r>
-        <w:t xml:space="preserve">Le somme relative alle Prenotazioni Future eventualmente incassate dal </w:t>
-      </w:r>
-      <w:proofErr w:type="spellStart"/>
-      <w:r>
-        <w:t>Property</w:t>
-      </w:r>
-      <w:proofErr w:type="spellEnd"/>
-      <w:r>
-        <w:t xml:space="preserve"> Manager, anche </w:t>
-      </w:r>
-      <w:r>
-        <w:rPr/>
-        <w:t>successivamente</w:t>
-      </w:r>
-      <w:r>
-        <w:t xml:space="preserve"> </w:t>
-      </w:r>
-      <w:r>
-        <w:t xml:space="preserve">alla cessazione </w:t>
-      </w:r>
-      <w:r>
-        <w:rPr/>
-        <w:t>del Contratto</w:t>
-      </w:r>
-      <w:r>
-        <w:t xml:space="preserve"> </w:t>
-      </w:r>
-      <w:r>
-        <w:t xml:space="preserve">(ad esempio accrediti delle piattaforme di prenotazione successivi al check-in), </w:t>
-      </w:r>
-      <w:r>
-        <w:t>sono</w:t>
-      </w:r>
-      <w:r>
-        <w:t xml:space="preserve"> </w:t>
-      </w:r>
-      <w:r>
-        <w:t>riversate al Mandant</w:t>
-      </w:r>
-      <w:r>
-        <w:t xml:space="preserve">e entro 30 (trenta) giorni dal </w:t>
-      </w:r>
-      <w:r>
-        <w:rPr/>
-        <w:t>relativo</w:t>
-      </w:r>
-      <w:r>
-        <w:t xml:space="preserve"> </w:t>
-      </w:r>
-      <w:r>
-        <w:t>incasso, al netto delle commissioni trattenute dalle piattaforme</w:t>
-      </w:r>
-      <w:r>
-        <w:t xml:space="preserve"> </w:t>
-      </w:r>
-      <w:r>
-        <w:rPr/>
-        <w:t>di prenotazione</w:t>
-      </w:r>
-      <w:r>
-        <w:t xml:space="preserve"> e del Compenso di Fine Mandato eventual</w:t>
-      </w:r>
-      <w:r>
-        <w:t>mente non ancora corrisposto.</w:t>
-      </w:r>
-    </w:p>
-    <w:p>
-      <w:pPr>
-        <w:pStyle w:val="Corpotesto"/>
-        <w:spacing w:before="120" w:line="360" w:lineRule="auto"/>
-        <w:jc w:val="both"/>
-      </w:pPr>
-      <w:r>
-        <w:t xml:space="preserve">Il Compenso di Fine Mandato non è dovuto in caso di risoluzione del Contratto per inadempimento del Property Manager ai sensi dell’art. 18.</w:t>
-      </w:r>
-    </w:p>
-    <w:p>
-      <w:pPr>
-        <w:pStyle w:val="Corpotesto"/>
-        <w:spacing w:before="129"/>
-        <w:rPr>
-          <w:rFonts w:ascii="Microsoft Sans Serif"/>
-        </w:rPr>
-      </w:pPr>
-    </w:p>
-    <w:p>
-      <w:pPr>
-        <w:pStyle w:val="Titolo21"/>
-        <w:numPr>
-          <w:ilvl w:val="0"/>
-          <w:numId w:val="9"/>
-        </w:numPr>
-        <w:tabs>
-          <w:tab w:val="left" w:pos="845"/>
-        </w:tabs>
-        <w:ind w:left="0" w:hanging="421"/>
-      </w:pPr>
-      <w:r>
-        <w:t xml:space="preserve">Clausola risolutiva </w:t>
-      </w:r>
-      <w:r>
-        <w:rPr>
-          <w:spacing w:val="-2"/>
-        </w:rPr>
-        <w:t>espressa</w:t>
-      </w:r>
-    </w:p>
-    <w:p>
-      <w:pPr>
-        <w:pStyle w:val="Corpotesto"/>
-        <w:spacing w:before="135" w:line="360" w:lineRule="auto"/>
-        <w:jc w:val="both"/>
-        <w:rPr/>
-      </w:pPr>
-      <w:r>
-        <w:rPr/>
-        <w:t>Ai sensi e per gli effetti dell’art. 1456 del Codice Civile, ciascuna Parte potrà dichiarare risolto di diritto il presente Contratto mediante comunicazione scritta all’altra Parte, qualora quest’ultima si renda inadempiente rispetto a una delle obbligazioni di seguito specificamente individuate, purché l’inadempimento sia imputabile alla Parte inadempiente e, ove previsto, non sia stato sanato entro il termine indicato nella relativa messa in mora.</w:t>
-      </w:r>
-    </w:p>
-    <w:p>
-      <w:pPr>
-        <w:tabs>
-          <w:tab w:val="left" w:pos="1319"/>
-        </w:tabs>
-        <w:spacing w:line="256" w:lineRule="exact"/>
-        <w:jc w:val="both"/>
-      </w:pPr>
-      <w:r>
-        <w:t>Quanto alle obbligazioni in capo al Mandante:</w:t>
-      </w:r>
-    </w:p>
-    <w:p>
-      <w:pPr>
-        <w:pStyle w:val="Paragrafoelenco"/>
-        <w:numPr>
-          <w:ilvl w:val="0"/>
-          <w:numId w:val="23"/>
-        </w:numPr>
-        <w:tabs>
-          <w:tab w:val="left" w:pos="1320"/>
-        </w:tabs>
-        <w:spacing w:before="122" w:line="360" w:lineRule="auto"/>
-        <w:jc w:val="both"/>
-      </w:pPr>
-      <w:r>
-        <w:t>il mancato pagamento delle somme spettanti al Property Manager dovute a titolo di compenso o rimborso spese, decorso il termine di 30 gg dalla ricezione della lettera di messa in mora;</w:t>
-      </w:r>
-    </w:p>
-    <w:p>
-      <w:pPr>
-        <w:pStyle w:val="Paragrafoelenco"/>
-        <w:numPr>
-          <w:ilvl w:val="0"/>
-          <w:numId w:val="23"/>
-        </w:numPr>
-        <w:tabs>
-          <w:tab w:val="left" w:pos="1320"/>
-        </w:tabs>
-        <w:spacing w:before="10" w:line="355" w:lineRule="auto"/>
-        <w:jc w:val="both"/>
-      </w:pPr>
-      <w:r>
-        <w:t xml:space="preserve">la mancata consegna dell’Immobile </w:t>
-      </w:r>
-      <w:r>
-        <w:t xml:space="preserve">al </w:t>
-      </w:r>
-      <w:proofErr w:type="spellStart"/>
-      <w:r>
-        <w:t>Property</w:t>
-      </w:r>
-      <w:proofErr w:type="spellEnd"/>
-      <w:r>
-        <w:t xml:space="preserve"> Manager </w:t>
-      </w:r>
-      <w:r>
-        <w:t>entro 10 giorni dalla ricezione della lettera di messa in mora;</w:t>
-      </w:r>
-    </w:p>
-    <w:p>
-      <w:pPr>
-        <w:pStyle w:val="Paragrafoelenco"/>
-        <w:numPr>
-          <w:ilvl w:val="0"/>
-          <w:numId w:val="23"/>
-        </w:numPr>
-        <w:spacing w:line="360" w:lineRule="auto"/>
-        <w:rPr/>
-      </w:pPr>
-      <w:r>
-        <w:rPr/>
-        <w:t xml:space="preserve">la mancata comunicazione al </w:t>
-      </w:r>
-      <w:proofErr w:type="spellStart"/>
-      <w:r>
-        <w:rPr/>
-        <w:t>Property</w:t>
-      </w:r>
-      <w:proofErr w:type="spellEnd"/>
-      <w:r>
-        <w:rPr/>
-        <w:t xml:space="preserve"> Manager di circostanze, informazioni o limitazioni giuridiche o materiali relative all’Immobile che siano rilevanti ai fini della corretta esecuzione dell’incarico, qualora tale omissione impedisca o renda significativamente più gravosa la gestione dell’Immobile.</w:t>
-      </w:r>
-    </w:p>
-    <w:p>
-      <w:pPr>
-        <w:tabs>
-          <w:tab w:val="left" w:pos="1320"/>
-        </w:tabs>
-      </w:pPr>
-      <w:r>
-        <w:t>Q</w:t>
-      </w:r>
-      <w:r>
-        <w:t>uanto alle obbligazioni in capo al Property Manager:</w:t>
+        <w:t>posti a suo carico nel presente Contratto;</w:t>
       </w:r>
     </w:p>
     <w:p>
@@ -3743,22 +3699,11 @@
         <w:tabs>
           <w:tab w:val="left" w:pos="1320"/>
         </w:tabs>
-        <w:spacing w:before="125" w:line="355" w:lineRule="auto"/>
-        <w:jc w:val="both"/>
-      </w:pPr>
-      <w:r>
-        <w:t xml:space="preserve">il mancato adempimento degli obblighi amministrativi e fiscali </w:t>
-      </w:r>
-      <w:r>
-        <w:rPr/>
-        <w:t>espressamente</w:t>
-      </w:r>
-      <w:r>
-        <w:rPr/>
-        <w:t xml:space="preserve"> </w:t>
-      </w:r>
-      <w:r>
-        <w:t>posti a suo carico nel presente Contratto;</w:t>
+        <w:spacing w:before="13"/>
+        <w:jc w:val="both"/>
+      </w:pPr>
+      <w:r>
+        <w:t>il mancato versamento delle somme dovute al Mandante in forza del presente Contratto, decorso il termine di 30 gg dalla ricezione della lettera di messa in mora;</w:t>
       </w:r>
     </w:p>
     <w:p>
@@ -3771,44 +3716,11 @@
         <w:tabs>
           <w:tab w:val="left" w:pos="1320"/>
         </w:tabs>
-        <w:spacing w:before="13"/>
-        <w:jc w:val="both"/>
-      </w:pPr>
-      <w:r>
-        <w:t>il mancato versamento delle somme dovute al Mandante in forza del presente Contratto, decorso il termine di 30 gg dalla ricezione della lettera di messa in mora;</w:t>
-      </w:r>
-    </w:p>
-    <w:p>
-      <w:pPr>
-        <w:pStyle w:val="Paragrafoelenco"/>
-        <w:numPr>
-          <w:ilvl w:val="0"/>
-          <w:numId w:val="25"/>
-        </w:numPr>
-        <w:tabs>
-          <w:tab w:val="left" w:pos="1320"/>
-        </w:tabs>
         <w:spacing w:before="131" w:line="360" w:lineRule="auto"/>
         <w:jc w:val="both"/>
       </w:pPr>
       <w:r>
-        <w:t>la mancata richiesta del deposito cauzionale iniziale dovuto dall’Ospite secondo l’art. 2, lett. I) ove venga accertata l’es</w:t>
-      </w:r>
-      <w:r>
-        <w:t xml:space="preserve">istenza di danni all’Immobile, agli arredi </w:t>
-      </w:r>
-      <w:r>
-        <w:rPr/>
-        <w:t xml:space="preserve">o alle dotazioni, </w:t>
-      </w:r>
-      <w:r>
-        <w:t xml:space="preserve">o </w:t>
-      </w:r>
-      <w:r>
-        <w:t>a</w:t>
-      </w:r>
-      <w:r>
-        <w:t>mmanchi, salvo il Property Manager se ne faccia carico nei confronti del Mandante;</w:t>
+        <w:t xml:space="preserve">la mancata richiesta del deposito cauzionale iniziale dovuto dall’Ospite secondo l’art. 2, lett. i), ove venga accertata l’esistenza di danni all’Immobile, agli arredi o alle dotazioni, o ammanchi, salvo il Property Manager se ne faccia carico nei confronti del Mandante;</w:t>
       </w:r>
     </w:p>
     <w:p>
@@ -3920,20 +3832,7 @@
         <w:jc w:val="both"/>
       </w:pPr>
       <w:r>
-        <w:t xml:space="preserve">Le Parti dichiarano di aver reciprocamente ricevuto le informazioni di cui all'art. 13 del </w:t>
-      </w:r>
-      <w:r>
-        <w:t xml:space="preserve"/>
-      </w:r>
-      <w:r>
-        <w:rPr/>
-        <w:t>GDPR</w:t>
-      </w:r>
-      <w:r>
-        <w:t xml:space="preserve"> </w:t>
-      </w:r>
-      <w:r>
-        <w:t>e di prestare, con la sottoscrizione della presente Scrittura Privata, il proprio consenso all’utilizzo dei rispettivi dati personali in relazione all’esecuzione della presente Scrittura Privata.</w:t>
+        <w:t xml:space="preserve">Le Parti dichiarano di aver reciprocamente ricevuto le informazioni di cui all’art. 13 del GDPR e di prestare, con la sottoscrizione del presente Contratto, il proprio consenso all’utilizzo dei rispettivi dati personali in relazione all’esecuzione del Contratto stesso.</w:t>
       </w:r>
     </w:p>
     <w:p>
@@ -3953,7 +3852,7 @@
         <w:jc w:val="both"/>
       </w:pPr>
       <w:r>
-        <w:t>A questo fine, in particolare, le Parti si danno reciprocamente atto di regolare gli adempimenti di cui alla Normativa sulla Privacy mediante il rilascio da parte del Property Manager al Mandante dell’informativa di legge.</w:t>
+        <w:t xml:space="preserve">A questo fine, in particolare, le Parti si danno reciprocamente atto di regolare gli adempimenti di cui alla Normativa Privacy mediante il rilascio da parte del Property Manager al Mandante dell’informativa di legge.</w:t>
       </w:r>
     </w:p>
     <w:p>

</xml_diff>

<commit_message>
Bozze generiche e contratto base: compenso al netto pulizie, fine mandato 30% del compenso
Co-Authored-By: Claude Opus 5.5 <noreply@anthropic.com>
Claude-Session: https://claude.ai/code/session_01WggD5zVqy5TCJTD9M5VXmn
</commit_message>
<xml_diff>
--- a/contratti/Contratto_Mandato_BB_Hospitality_def.docx
+++ b/contratti/Contratto_Mandato_BB_Hospitality_def.docx
@@ -2590,7 +2590,7 @@
         <w:jc w:val="both"/>
       </w:pPr>
       <w:r>
-        <w:t xml:space="preserve">Per l’attività di gestione e per i servizi di cui all’art. 2, al Property Manager spetta un compenso pari al 20% (venti per cento) del Costo del Pernottamento di ciascuna prenotazione. Per “Costo del Pernottamento” si intende il prezzo dei pernottamenti dovuto dall’Ospite, come risultante dalla prenotazione, al netto delle commissioni trattenute dalle piattaforme di prenotazione ed escluse l’imposta di soggiorno, l’eventuale deposito cauzionale, le spese di pulizia finale eventualmente addebitate separatamente all’Ospite e le commissioni di servizio addebitate all’Ospite dalle piattaforme.</w:t>
+        <w:t xml:space="preserve">Per l’attività di gestione e per i servizi di cui all’art. 2, al Property Manager spetta un compenso pari al 20% (venti per cento) del Costo del Pernottamento di ciascuna prenotazione. Per “Costo del Pernottamento” si intende il prezzo dei pernottamenti dovuto dall’Ospite, come risultante dalla prenotazione, al netto delle commissioni trattenute dalle piattaforme di prenotazione e delle spese di pulizia relative al soggiorno, ed esclusi l’imposta di soggiorno, l’eventuale deposito cauzionale e le commissioni di servizio addebitate all’Ospite dalle piattaforme.</w:t>
       </w:r>
     </w:p>
     <w:p>
@@ -3321,7 +3321,7 @@
         <w:jc w:val="both"/>
       </w:pPr>
       <w:r>
-        <w:t xml:space="preserve">A fronte dell’attività di promozione e acquisizione svolta, per le Prenotazioni Future il Mandante riconosce al Property Manager un compenso forfettario (il “Compenso di Fine Mandato”) pari al 30% (trenta per cento) del Costo del Pernottamento, come definito all’art. 11, relativo ai pernottamenti successivi alla data di cessazione.</w:t>
+        <w:t xml:space="preserve">A fronte dell’attività di promozione e acquisizione svolta, per le Prenotazioni Future il Mandante riconosce al Property Manager un compenso forfettario (il “Compenso di Fine Mandato”) pari al 30% (trenta per cento) del compenso che sarebbe spettato al Property Manager ai sensi dell’art. 11 sul Costo del Pernottamento relativo ai pernottamenti successivi alla data di cessazione.</w:t>
       </w:r>
     </w:p>
     <w:p>

</xml_diff>